<commit_message>
Update position paper with latest changes
</commit_message>
<xml_diff>
--- a/docs/Common_Sour_Fig_Position_Paper.docx
+++ b/docs/Common_Sour_Fig_Position_Paper.docx
@@ -138,6 +138,7 @@
         </w:numPr>
         <w:bidi w:val="0"/>
         <w:spacing w:before="240" w:after="240"/>
+        <w:ind w:hanging="0" w:left="0"/>
         <w:jc w:val="left"/>
         <w:rPr/>
       </w:pPr>
@@ -179,6 +180,7 @@
         </w:numPr>
         <w:bidi w:val="0"/>
         <w:spacing w:before="240" w:after="240"/>
+        <w:ind w:hanging="0" w:left="0"/>
         <w:jc w:val="left"/>
         <w:rPr/>
       </w:pPr>
@@ -255,6 +257,7 @@
         </w:numPr>
         <w:bidi w:val="0"/>
         <w:spacing w:before="240" w:after="240"/>
+        <w:ind w:hanging="0" w:left="0"/>
         <w:jc w:val="left"/>
         <w:rPr/>
       </w:pPr>
@@ -272,6 +275,7 @@
         </w:numPr>
         <w:bidi w:val="0"/>
         <w:spacing w:before="180" w:after="180"/>
+        <w:ind w:hanging="0" w:left="0"/>
         <w:jc w:val="left"/>
         <w:rPr/>
       </w:pPr>
@@ -331,7 +335,7 @@
         <w:pStyle w:val="ListParagraph"/>
         <w:numPr>
           <w:ilvl w:val="0"/>
-          <w:numId w:val="3"/>
+          <w:numId w:val="5"/>
         </w:numPr>
         <w:bidi w:val="0"/>
         <w:jc w:val="left"/>
@@ -347,7 +351,7 @@
         <w:pStyle w:val="ListParagraph"/>
         <w:numPr>
           <w:ilvl w:val="0"/>
-          <w:numId w:val="2"/>
+          <w:numId w:val="6"/>
         </w:numPr>
         <w:bidi w:val="0"/>
         <w:jc w:val="left"/>
@@ -363,7 +367,7 @@
         <w:pStyle w:val="ListParagraph"/>
         <w:numPr>
           <w:ilvl w:val="0"/>
-          <w:numId w:val="2"/>
+          <w:numId w:val="7"/>
         </w:numPr>
         <w:bidi w:val="0"/>
         <w:jc w:val="left"/>
@@ -379,7 +383,7 @@
         <w:pStyle w:val="ListParagraph"/>
         <w:numPr>
           <w:ilvl w:val="0"/>
-          <w:numId w:val="2"/>
+          <w:numId w:val="8"/>
         </w:numPr>
         <w:bidi w:val="0"/>
         <w:jc w:val="left"/>
@@ -395,7 +399,7 @@
         <w:pStyle w:val="ListParagraph"/>
         <w:numPr>
           <w:ilvl w:val="0"/>
-          <w:numId w:val="2"/>
+          <w:numId w:val="9"/>
         </w:numPr>
         <w:bidi w:val="0"/>
         <w:spacing w:before="0" w:after="240"/>
@@ -416,6 +420,7 @@
         </w:numPr>
         <w:bidi w:val="0"/>
         <w:spacing w:before="180" w:after="180"/>
+        <w:ind w:hanging="0" w:left="0"/>
         <w:jc w:val="left"/>
         <w:rPr/>
       </w:pPr>
@@ -470,6 +475,7 @@
         </w:numPr>
         <w:bidi w:val="0"/>
         <w:spacing w:before="240" w:after="240"/>
+        <w:ind w:hanging="0" w:left="0"/>
         <w:jc w:val="left"/>
         <w:rPr/>
       </w:pPr>
@@ -487,6 +493,7 @@
         </w:numPr>
         <w:bidi w:val="0"/>
         <w:spacing w:before="180" w:after="180"/>
+        <w:ind w:hanging="0" w:left="0"/>
         <w:jc w:val="left"/>
         <w:rPr/>
       </w:pPr>
@@ -526,7 +533,7 @@
         <w:pStyle w:val="ListParagraph"/>
         <w:numPr>
           <w:ilvl w:val="0"/>
-          <w:numId w:val="2"/>
+          <w:numId w:val="10"/>
         </w:numPr>
         <w:bidi w:val="0"/>
         <w:jc w:val="left"/>
@@ -542,7 +549,7 @@
         <w:pStyle w:val="ListParagraph"/>
         <w:numPr>
           <w:ilvl w:val="0"/>
-          <w:numId w:val="2"/>
+          <w:numId w:val="11"/>
         </w:numPr>
         <w:bidi w:val="0"/>
         <w:jc w:val="left"/>
@@ -558,7 +565,7 @@
         <w:pStyle w:val="ListParagraph"/>
         <w:numPr>
           <w:ilvl w:val="0"/>
-          <w:numId w:val="2"/>
+          <w:numId w:val="12"/>
         </w:numPr>
         <w:bidi w:val="0"/>
         <w:jc w:val="left"/>
@@ -574,7 +581,7 @@
         <w:pStyle w:val="ListParagraph"/>
         <w:numPr>
           <w:ilvl w:val="0"/>
-          <w:numId w:val="2"/>
+          <w:numId w:val="13"/>
         </w:numPr>
         <w:bidi w:val="0"/>
         <w:spacing w:before="0" w:after="240"/>
@@ -595,6 +602,7 @@
         </w:numPr>
         <w:bidi w:val="0"/>
         <w:spacing w:before="180" w:after="180"/>
+        <w:ind w:hanging="0" w:left="0"/>
         <w:jc w:val="left"/>
         <w:rPr/>
       </w:pPr>
@@ -621,7 +629,7 @@
         <w:pStyle w:val="ListParagraph"/>
         <w:numPr>
           <w:ilvl w:val="0"/>
-          <w:numId w:val="2"/>
+          <w:numId w:val="14"/>
         </w:numPr>
         <w:bidi w:val="0"/>
         <w:jc w:val="left"/>
@@ -637,7 +645,7 @@
         <w:pStyle w:val="ListParagraph"/>
         <w:numPr>
           <w:ilvl w:val="0"/>
-          <w:numId w:val="2"/>
+          <w:numId w:val="15"/>
         </w:numPr>
         <w:bidi w:val="0"/>
         <w:jc w:val="left"/>
@@ -653,7 +661,7 @@
         <w:pStyle w:val="ListParagraph"/>
         <w:numPr>
           <w:ilvl w:val="0"/>
-          <w:numId w:val="2"/>
+          <w:numId w:val="16"/>
         </w:numPr>
         <w:bidi w:val="0"/>
         <w:jc w:val="left"/>
@@ -669,7 +677,7 @@
         <w:pStyle w:val="ListParagraph"/>
         <w:numPr>
           <w:ilvl w:val="0"/>
-          <w:numId w:val="2"/>
+          <w:numId w:val="17"/>
         </w:numPr>
         <w:bidi w:val="0"/>
         <w:spacing w:before="0" w:after="240"/>
@@ -703,6 +711,7 @@
         </w:numPr>
         <w:bidi w:val="0"/>
         <w:spacing w:before="240" w:after="240"/>
+        <w:ind w:hanging="0" w:left="0"/>
         <w:jc w:val="left"/>
         <w:rPr/>
       </w:pPr>
@@ -744,6 +753,7 @@
         </w:numPr>
         <w:bidi w:val="0"/>
         <w:spacing w:before="180" w:after="180"/>
+        <w:ind w:hanging="0" w:left="0"/>
         <w:jc w:val="left"/>
         <w:rPr/>
       </w:pPr>
@@ -790,7 +800,7 @@
         <w:pStyle w:val="ListParagraph"/>
         <w:numPr>
           <w:ilvl w:val="0"/>
-          <w:numId w:val="2"/>
+          <w:numId w:val="18"/>
         </w:numPr>
         <w:bidi w:val="0"/>
         <w:jc w:val="left"/>
@@ -806,7 +816,7 @@
         <w:pStyle w:val="ListParagraph"/>
         <w:numPr>
           <w:ilvl w:val="0"/>
-          <w:numId w:val="2"/>
+          <w:numId w:val="19"/>
         </w:numPr>
         <w:bidi w:val="0"/>
         <w:jc w:val="left"/>
@@ -822,7 +832,7 @@
         <w:pStyle w:val="ListParagraph"/>
         <w:numPr>
           <w:ilvl w:val="0"/>
-          <w:numId w:val="2"/>
+          <w:numId w:val="20"/>
         </w:numPr>
         <w:bidi w:val="0"/>
         <w:jc w:val="left"/>
@@ -838,7 +848,7 @@
         <w:pStyle w:val="ListParagraph"/>
         <w:numPr>
           <w:ilvl w:val="0"/>
-          <w:numId w:val="2"/>
+          <w:numId w:val="21"/>
         </w:numPr>
         <w:bidi w:val="0"/>
         <w:spacing w:before="0" w:after="240"/>
@@ -872,6 +882,7 @@
         </w:numPr>
         <w:bidi w:val="0"/>
         <w:spacing w:before="180" w:after="180"/>
+        <w:ind w:hanging="0" w:left="0"/>
         <w:jc w:val="left"/>
         <w:rPr/>
       </w:pPr>
@@ -920,31 +931,7 @@
       </w:r>
       <w:r>
         <w:rPr/>
-        <w:t xml:space="preserve"> In 1993, Dr. Theron filed a trademark application for the word "Rooibos" with the US Patent and Trademark Office (USPTO) through her company, Forever Young. </w:t>
-      </w:r>
-      <w:r>
-        <w:rPr/>
-        <w:t>The story broke in 2000 when I published a</w:t>
-      </w:r>
-      <w:r>
-        <w:rPr/>
-        <w:t xml:space="preserve">n article </w:t>
-      </w:r>
-      <w:r>
-        <w:rPr/>
-        <w:t>in the Cape Times detailing the trademark and patent applications related to nutr</w:t>
-      </w:r>
-      <w:r>
-        <w:rPr/>
-        <w:t>a</w:t>
-      </w:r>
-      <w:r>
-        <w:rPr/>
-        <w:t xml:space="preserve">ceatical and beauty products </w:t>
-      </w:r>
-      <w:r>
-        <w:rPr/>
-        <w:t>involving a company called Annique.</w:t>
+        <w:t xml:space="preserve"> In 1993, Dr. Theron filed a trademark application for the word "Rooibos" with the US Patent and Trademark Office (USPTO) through her company, Forever Young. The story broke in 2000 when I published an article in the Cape Times detailing the trademark and patent applications related to nutraceatical and beauty products involving a company called Annique.</w:t>
       </w:r>
     </w:p>
     <w:p>
@@ -1025,7 +1012,7 @@
         <w:pStyle w:val="ListParagraph"/>
         <w:numPr>
           <w:ilvl w:val="0"/>
-          <w:numId w:val="2"/>
+          <w:numId w:val="22"/>
         </w:numPr>
         <w:bidi w:val="0"/>
         <w:jc w:val="left"/>
@@ -1041,7 +1028,7 @@
         <w:pStyle w:val="ListParagraph"/>
         <w:numPr>
           <w:ilvl w:val="0"/>
-          <w:numId w:val="2"/>
+          <w:numId w:val="23"/>
         </w:numPr>
         <w:bidi w:val="0"/>
         <w:jc w:val="left"/>
@@ -1073,7 +1060,7 @@
         <w:pStyle w:val="ListParagraph"/>
         <w:numPr>
           <w:ilvl w:val="0"/>
-          <w:numId w:val="2"/>
+          <w:numId w:val="24"/>
         </w:numPr>
         <w:bidi w:val="0"/>
         <w:jc w:val="left"/>
@@ -1105,7 +1092,7 @@
         <w:pStyle w:val="ListParagraph"/>
         <w:numPr>
           <w:ilvl w:val="0"/>
-          <w:numId w:val="2"/>
+          <w:numId w:val="25"/>
         </w:numPr>
         <w:bidi w:val="0"/>
         <w:spacing w:before="0" w:after="240"/>
@@ -1127,44 +1114,20 @@
       </w:pPr>
       <w:r>
         <w:rPr/>
-        <w:t xml:space="preserve">After sustained advocacy by the South African Rooibos Council and international pressure, </w:t>
-      </w:r>
-      <w:r>
-        <w:rPr/>
-        <w:t xml:space="preserve">both </w:t>
-      </w:r>
-      <w:r>
-        <w:rPr/>
-        <w:t xml:space="preserve">trademark </w:t>
-      </w:r>
-      <w:r>
-        <w:rPr/>
-        <w:t>and patent cases</w:t>
-      </w:r>
-      <w:r>
-        <w:rPr/>
-        <w:t xml:space="preserve"> was eventually challenged and cancelled. However, the case illustrated that biopiracy threats can emanate not only from foreign entities but also from domestic commercial actors who commodify traditional knowledge without community consent or benefit-sharing.</w:t>
-      </w:r>
-    </w:p>
-    <w:p>
-      <w:pPr>
-        <w:pStyle w:val="Normal"/>
-        <w:bidi w:val="0"/>
-        <w:spacing w:before="0" w:after="240"/>
-        <w:jc w:val="left"/>
-        <w:rPr/>
-      </w:pPr>
-      <w:r>
-        <w:rPr/>
-        <w:t xml:space="preserve">Unlike the Hoodia case -- which resulted in tangible benefit-sharing agreements that directed resources to indigenous communities -- the Rooibos controversy primarily involved commercial disputes between South African industry stakeholders, with minimal direct benefit accruing to </w:t>
-      </w:r>
-      <w:r>
-        <w:rPr/>
-        <w:t>indigenous</w:t>
-      </w:r>
-      <w:r>
-        <w:rPr/>
-        <w:t xml:space="preserve"> knowledge holders whose ancestors cultivated and transmitted knowledge about the plant.</w:t>
+        <w:t>After sustained advocacy by the South African Rooibos Council and international pressure, both trademark and patent cases was eventually challenged and cancelled. However, the case illustrated that biopiracy threats can emanate not only from foreign entities but also from domestic commercial actors who commodify traditional knowledge without community consent or benefit-sharing.</w:t>
+      </w:r>
+    </w:p>
+    <w:p>
+      <w:pPr>
+        <w:pStyle w:val="Normal"/>
+        <w:bidi w:val="0"/>
+        <w:spacing w:before="0" w:after="240"/>
+        <w:jc w:val="left"/>
+        <w:rPr/>
+      </w:pPr>
+      <w:r>
+        <w:rPr/>
+        <w:t>Unlike the Hoodia case -- which resulted in tangible benefit-sharing agreements that directed resources to indigenous communities -- the Rooibos controversy primarily involved commercial disputes between South African industry stakeholders, with minimal direct benefit accruing to indigenous knowledge holders whose ancestors cultivated and transmitted knowledge about the plant.</w:t>
       </w:r>
     </w:p>
     <w:p>
@@ -1176,6 +1139,7 @@
         </w:numPr>
         <w:bidi w:val="0"/>
         <w:spacing w:before="240" w:after="240"/>
+        <w:ind w:hanging="0" w:left="0"/>
         <w:jc w:val="left"/>
         <w:rPr/>
       </w:pPr>
@@ -1193,6 +1157,7 @@
         </w:numPr>
         <w:bidi w:val="0"/>
         <w:spacing w:before="180" w:after="180"/>
+        <w:ind w:hanging="0" w:left="0"/>
         <w:jc w:val="left"/>
         <w:rPr/>
       </w:pPr>
@@ -1219,7 +1184,7 @@
         <w:pStyle w:val="ListParagraph"/>
         <w:numPr>
           <w:ilvl w:val="0"/>
-          <w:numId w:val="2"/>
+          <w:numId w:val="26"/>
         </w:numPr>
         <w:bidi w:val="0"/>
         <w:jc w:val="left"/>
@@ -1235,7 +1200,7 @@
         <w:pStyle w:val="ListParagraph"/>
         <w:numPr>
           <w:ilvl w:val="0"/>
-          <w:numId w:val="2"/>
+          <w:numId w:val="27"/>
         </w:numPr>
         <w:bidi w:val="0"/>
         <w:jc w:val="left"/>
@@ -1251,7 +1216,7 @@
         <w:pStyle w:val="ListParagraph"/>
         <w:numPr>
           <w:ilvl w:val="0"/>
-          <w:numId w:val="2"/>
+          <w:numId w:val="28"/>
         </w:numPr>
         <w:bidi w:val="0"/>
         <w:jc w:val="left"/>
@@ -1267,7 +1232,7 @@
         <w:pStyle w:val="ListParagraph"/>
         <w:numPr>
           <w:ilvl w:val="0"/>
-          <w:numId w:val="2"/>
+          <w:numId w:val="29"/>
         </w:numPr>
         <w:bidi w:val="0"/>
         <w:spacing w:before="0" w:after="240"/>
@@ -1301,6 +1266,7 @@
         </w:numPr>
         <w:bidi w:val="0"/>
         <w:spacing w:before="180" w:after="180"/>
+        <w:ind w:hanging="0" w:left="0"/>
         <w:jc w:val="left"/>
         <w:rPr/>
       </w:pPr>
@@ -1327,7 +1293,7 @@
         <w:pStyle w:val="ListParagraph"/>
         <w:numPr>
           <w:ilvl w:val="0"/>
-          <w:numId w:val="2"/>
+          <w:numId w:val="30"/>
         </w:numPr>
         <w:bidi w:val="0"/>
         <w:jc w:val="left"/>
@@ -1343,7 +1309,7 @@
         <w:pStyle w:val="ListParagraph"/>
         <w:numPr>
           <w:ilvl w:val="0"/>
-          <w:numId w:val="2"/>
+          <w:numId w:val="31"/>
         </w:numPr>
         <w:bidi w:val="0"/>
         <w:jc w:val="left"/>
@@ -1359,7 +1325,7 @@
         <w:pStyle w:val="ListParagraph"/>
         <w:numPr>
           <w:ilvl w:val="0"/>
-          <w:numId w:val="2"/>
+          <w:numId w:val="32"/>
         </w:numPr>
         <w:bidi w:val="0"/>
         <w:spacing w:before="0" w:after="240"/>
@@ -1393,6 +1359,7 @@
         </w:numPr>
         <w:bidi w:val="0"/>
         <w:spacing w:before="240" w:after="240"/>
+        <w:ind w:hanging="0" w:left="0"/>
         <w:jc w:val="left"/>
         <w:rPr/>
       </w:pPr>
@@ -1423,6 +1390,7 @@
         </w:numPr>
         <w:bidi w:val="0"/>
         <w:spacing w:before="180" w:after="180"/>
+        <w:ind w:hanging="0" w:left="0"/>
         <w:jc w:val="left"/>
         <w:rPr/>
       </w:pPr>
@@ -1460,7 +1428,7 @@
         <w:pStyle w:val="ListParagraph"/>
         <w:numPr>
           <w:ilvl w:val="0"/>
-          <w:numId w:val="2"/>
+          <w:numId w:val="33"/>
         </w:numPr>
         <w:bidi w:val="0"/>
         <w:jc w:val="left"/>
@@ -1476,7 +1444,7 @@
         <w:pStyle w:val="ListParagraph"/>
         <w:numPr>
           <w:ilvl w:val="0"/>
-          <w:numId w:val="2"/>
+          <w:numId w:val="34"/>
         </w:numPr>
         <w:bidi w:val="0"/>
         <w:jc w:val="left"/>
@@ -1492,7 +1460,7 @@
         <w:pStyle w:val="ListParagraph"/>
         <w:numPr>
           <w:ilvl w:val="0"/>
-          <w:numId w:val="2"/>
+          <w:numId w:val="35"/>
         </w:numPr>
         <w:bidi w:val="0"/>
         <w:spacing w:before="0" w:after="240"/>
@@ -1526,6 +1494,7 @@
         </w:numPr>
         <w:bidi w:val="0"/>
         <w:spacing w:before="180" w:after="180"/>
+        <w:ind w:hanging="0" w:left="0"/>
         <w:jc w:val="left"/>
         <w:rPr/>
       </w:pPr>
@@ -1539,7 +1508,7 @@
         <w:pStyle w:val="ListParagraph"/>
         <w:numPr>
           <w:ilvl w:val="0"/>
-          <w:numId w:val="2"/>
+          <w:numId w:val="36"/>
         </w:numPr>
         <w:bidi w:val="0"/>
         <w:jc w:val="left"/>
@@ -1571,44 +1540,22 @@
         <w:pStyle w:val="ListParagraph"/>
         <w:numPr>
           <w:ilvl w:val="0"/>
-          <w:numId w:val="2"/>
-        </w:numPr>
-        <w:bidi w:val="0"/>
-        <w:jc w:val="left"/>
-        <w:rPr/>
-      </w:pPr>
-      <w:r>
-        <w:rPr/>
-        <w:t xml:space="preserve">Enhanced prior art searches: Patent examiners should consult traditional knowledge databases </w:t>
-      </w:r>
-      <w:r>
-        <w:rPr/>
-        <w:t>such as</w:t>
-      </w:r>
-      <w:r>
-        <w:rPr/>
-        <w:t xml:space="preserve"> </w:t>
+          <w:numId w:val="37"/>
+        </w:numPr>
+        <w:bidi w:val="0"/>
+        <w:jc w:val="left"/>
+        <w:rPr/>
+      </w:pPr>
+      <w:r>
+        <w:rPr/>
+        <w:t xml:space="preserve">Enhanced prior art searches: Patent examiners should consult traditional knowledge databases such as </w:t>
       </w:r>
       <w:r>
         <w:rPr>
           <w:rFonts w:ascii="arial;helvetica;sans-serif" w:hAnsi="arial;helvetica;sans-serif"/>
           <w:sz w:val="24"/>
         </w:rPr>
-        <w:t>Indigenous Knowledge Registration System (IKRS),</w:t>
-      </w:r>
-      <w:r>
-        <w:rPr>
-          <w:rFonts w:ascii="arial;helvetica;sans-serif" w:hAnsi="arial;helvetica;sans-serif"/>
-          <w:sz w:val="24"/>
-        </w:rPr>
-        <w:t>the</w:t>
-      </w:r>
-      <w:r>
-        <w:rPr>
-          <w:rFonts w:ascii="arial;helvetica;sans-serif" w:hAnsi="arial;helvetica;sans-serif"/>
-          <w:sz w:val="24"/>
-        </w:rPr>
-        <w:t xml:space="preserve"> </w:t>
+        <w:t xml:space="preserve">Indigenous Knowledge Registration System (IKRS),the </w:t>
       </w:r>
       <w:hyperlink r:id="rId2">
         <w:r>
@@ -1625,14 +1572,7 @@
           <w:rFonts w:ascii="arial;helvetica;sans-serif" w:hAnsi="arial;helvetica;sans-serif"/>
           <w:sz w:val="24"/>
         </w:rPr>
-        <w:t>,</w:t>
-      </w:r>
-      <w:r>
-        <w:rPr>
-          <w:rFonts w:ascii="arial;helvetica;sans-serif" w:hAnsi="arial;helvetica;sans-serif"/>
-          <w:sz w:val="24"/>
-        </w:rPr>
-        <w:t xml:space="preserve"> </w:t>
+        <w:t xml:space="preserve">, </w:t>
       </w:r>
       <w:r>
         <w:rPr/>
@@ -1660,62 +1600,42 @@
         <w:pStyle w:val="ListParagraph"/>
         <w:numPr>
           <w:ilvl w:val="0"/>
-          <w:numId w:val="2"/>
-        </w:numPr>
-        <w:bidi w:val="0"/>
-        <w:jc w:val="left"/>
-        <w:rPr/>
-      </w:pPr>
-      <w:r>
-        <w:rPr/>
-        <w:t xml:space="preserve">Establish independent digital databases from National databases that can act as independent verifiers, tied to local, regional communities </w:t>
-      </w:r>
-      <w:r>
-        <w:rPr/>
-        <w:t>and their unique concerns</w:t>
-      </w:r>
-      <w:r>
-        <w:rPr/>
-        <w:t>.</w:t>
-      </w:r>
-    </w:p>
-    <w:p>
-      <w:pPr>
-        <w:pStyle w:val="ListParagraph"/>
-        <w:bidi w:val="0"/>
-        <w:jc w:val="left"/>
-        <w:rPr/>
-      </w:pPr>
-      <w:r>
-        <w:rPr/>
-      </w:r>
-    </w:p>
-    <w:p>
-      <w:pPr>
-        <w:pStyle w:val="ListParagraph"/>
-        <w:numPr>
-          <w:ilvl w:val="0"/>
-          <w:numId w:val="2"/>
-        </w:numPr>
-        <w:bidi w:val="0"/>
-        <w:jc w:val="left"/>
-        <w:rPr/>
-      </w:pPr>
-      <w:r>
-        <w:rPr/>
-        <w:t xml:space="preserve">Community consultation mechanisms: Patent offices should establish formal channels for indigenous communities to submit observations or oppositions during examination. </w:t>
-      </w:r>
-      <w:r>
-        <w:rPr/>
-        <w:t xml:space="preserve">A lot </w:t>
-      </w:r>
-      <w:r>
-        <w:rPr/>
-        <w:t xml:space="preserve">more needs to be done to make patent applications publically available </w:t>
-      </w:r>
-      <w:r>
-        <w:rPr/>
-        <w:t>and open to scrutiny.</w:t>
+          <w:numId w:val="38"/>
+        </w:numPr>
+        <w:bidi w:val="0"/>
+        <w:jc w:val="left"/>
+        <w:rPr/>
+      </w:pPr>
+      <w:r>
+        <w:rPr/>
+        <w:t>Establish independent digital databases from National databases that can act as independent verifiers, tied to local, regional communities and their unique concerns.</w:t>
+      </w:r>
+    </w:p>
+    <w:p>
+      <w:pPr>
+        <w:pStyle w:val="ListParagraph"/>
+        <w:bidi w:val="0"/>
+        <w:jc w:val="left"/>
+        <w:rPr/>
+      </w:pPr>
+      <w:r>
+        <w:rPr/>
+      </w:r>
+    </w:p>
+    <w:p>
+      <w:pPr>
+        <w:pStyle w:val="ListParagraph"/>
+        <w:numPr>
+          <w:ilvl w:val="0"/>
+          <w:numId w:val="39"/>
+        </w:numPr>
+        <w:bidi w:val="0"/>
+        <w:jc w:val="left"/>
+        <w:rPr/>
+      </w:pPr>
+      <w:r>
+        <w:rPr/>
+        <w:t>Community consultation mechanisms: Patent offices should establish formal channels for indigenous communities to submit observations or oppositions during examination. A lot more needs to be done to make patent applications publically available and open to scrutiny.</w:t>
       </w:r>
     </w:p>
     <w:p>
@@ -1739,7 +1659,7 @@
         <w:pStyle w:val="ListParagraph"/>
         <w:numPr>
           <w:ilvl w:val="0"/>
-          <w:numId w:val="2"/>
+          <w:numId w:val="40"/>
         </w:numPr>
         <w:bidi w:val="0"/>
         <w:spacing w:before="0" w:after="240"/>
@@ -1760,6 +1680,7 @@
         </w:numPr>
         <w:bidi w:val="0"/>
         <w:spacing w:before="180" w:after="180"/>
+        <w:ind w:hanging="0" w:left="0"/>
         <w:jc w:val="left"/>
         <w:rPr/>
       </w:pPr>
@@ -1773,7 +1694,7 @@
         <w:pStyle w:val="ListParagraph"/>
         <w:numPr>
           <w:ilvl w:val="0"/>
-          <w:numId w:val="2"/>
+          <w:numId w:val="41"/>
         </w:numPr>
         <w:bidi w:val="0"/>
         <w:jc w:val="left"/>
@@ -1805,7 +1726,7 @@
         <w:pStyle w:val="ListParagraph"/>
         <w:numPr>
           <w:ilvl w:val="0"/>
-          <w:numId w:val="2"/>
+          <w:numId w:val="42"/>
         </w:numPr>
         <w:bidi w:val="0"/>
         <w:jc w:val="left"/>
@@ -1837,7 +1758,7 @@
         <w:pStyle w:val="ListParagraph"/>
         <w:numPr>
           <w:ilvl w:val="0"/>
-          <w:numId w:val="2"/>
+          <w:numId w:val="43"/>
         </w:numPr>
         <w:bidi w:val="0"/>
         <w:jc w:val="left"/>
@@ -1869,7 +1790,7 @@
         <w:pStyle w:val="ListParagraph"/>
         <w:numPr>
           <w:ilvl w:val="0"/>
-          <w:numId w:val="2"/>
+          <w:numId w:val="44"/>
         </w:numPr>
         <w:bidi w:val="0"/>
         <w:jc w:val="left"/>
@@ -1901,7 +1822,7 @@
         <w:pStyle w:val="ListParagraph"/>
         <w:numPr>
           <w:ilvl w:val="0"/>
-          <w:numId w:val="2"/>
+          <w:numId w:val="45"/>
         </w:numPr>
         <w:bidi w:val="0"/>
         <w:spacing w:before="0" w:after="240"/>
@@ -1922,6 +1843,7 @@
         </w:numPr>
         <w:bidi w:val="0"/>
         <w:spacing w:before="180" w:after="180"/>
+        <w:ind w:hanging="0" w:left="0"/>
         <w:jc w:val="left"/>
         <w:rPr/>
       </w:pPr>
@@ -1935,7 +1857,7 @@
         <w:pStyle w:val="ListParagraph"/>
         <w:numPr>
           <w:ilvl w:val="0"/>
-          <w:numId w:val="2"/>
+          <w:numId w:val="46"/>
         </w:numPr>
         <w:bidi w:val="0"/>
         <w:jc w:val="left"/>
@@ -1967,7 +1889,7 @@
         <w:pStyle w:val="ListParagraph"/>
         <w:numPr>
           <w:ilvl w:val="0"/>
-          <w:numId w:val="2"/>
+          <w:numId w:val="47"/>
         </w:numPr>
         <w:bidi w:val="0"/>
         <w:jc w:val="left"/>
@@ -1999,7 +1921,7 @@
         <w:pStyle w:val="ListParagraph"/>
         <w:numPr>
           <w:ilvl w:val="0"/>
-          <w:numId w:val="2"/>
+          <w:numId w:val="48"/>
         </w:numPr>
         <w:bidi w:val="0"/>
         <w:jc w:val="left"/>
@@ -2031,19 +1953,15 @@
         <w:pStyle w:val="ListParagraph"/>
         <w:numPr>
           <w:ilvl w:val="0"/>
-          <w:numId w:val="2"/>
-        </w:numPr>
-        <w:bidi w:val="0"/>
-        <w:jc w:val="left"/>
-        <w:rPr/>
-      </w:pPr>
-      <w:r>
-        <w:rPr/>
-        <w:t xml:space="preserve">Traditional knowledge databases: Support expansion and maintenance of defensive publication databases that document traditional knowledge to prevent inappropriate patenting </w:t>
-      </w:r>
-      <w:r>
-        <w:rPr/>
-        <w:t>that are independent of national government wherever possible to act as independent verification of the sovereign data.</w:t>
+          <w:numId w:val="49"/>
+        </w:numPr>
+        <w:bidi w:val="0"/>
+        <w:jc w:val="left"/>
+        <w:rPr/>
+      </w:pPr>
+      <w:r>
+        <w:rPr/>
+        <w:t>Traditional knowledge databases: Support expansion and maintenance of defensive publication databases that document traditional knowledge to prevent inappropriate patenting that are independent of national government wherever possible to act as independent verification of the sovereign data.</w:t>
       </w:r>
     </w:p>
     <w:p>
@@ -2067,7 +1985,7 @@
         <w:pStyle w:val="ListParagraph"/>
         <w:numPr>
           <w:ilvl w:val="0"/>
-          <w:numId w:val="2"/>
+          <w:numId w:val="50"/>
         </w:numPr>
         <w:bidi w:val="0"/>
         <w:spacing w:before="0" w:after="240"/>
@@ -2088,6 +2006,7 @@
         </w:numPr>
         <w:bidi w:val="0"/>
         <w:spacing w:before="180" w:after="180"/>
+        <w:ind w:hanging="0" w:left="0"/>
         <w:jc w:val="left"/>
         <w:rPr/>
       </w:pPr>
@@ -2101,7 +2020,7 @@
         <w:pStyle w:val="ListParagraph"/>
         <w:numPr>
           <w:ilvl w:val="0"/>
-          <w:numId w:val="2"/>
+          <w:numId w:val="51"/>
         </w:numPr>
         <w:bidi w:val="0"/>
         <w:jc w:val="left"/>
@@ -2133,7 +2052,7 @@
         <w:pStyle w:val="ListParagraph"/>
         <w:numPr>
           <w:ilvl w:val="0"/>
-          <w:numId w:val="2"/>
+          <w:numId w:val="52"/>
         </w:numPr>
         <w:bidi w:val="0"/>
         <w:jc w:val="left"/>
@@ -2165,7 +2084,7 @@
         <w:pStyle w:val="ListParagraph"/>
         <w:numPr>
           <w:ilvl w:val="0"/>
-          <w:numId w:val="2"/>
+          <w:numId w:val="53"/>
         </w:numPr>
         <w:bidi w:val="0"/>
         <w:jc w:val="left"/>
@@ -2197,7 +2116,7 @@
         <w:pStyle w:val="ListParagraph"/>
         <w:numPr>
           <w:ilvl w:val="0"/>
-          <w:numId w:val="2"/>
+          <w:numId w:val="54"/>
         </w:numPr>
         <w:bidi w:val="0"/>
         <w:jc w:val="left"/>
@@ -2229,7 +2148,7 @@
         <w:pStyle w:val="ListParagraph"/>
         <w:numPr>
           <w:ilvl w:val="0"/>
-          <w:numId w:val="2"/>
+          <w:numId w:val="55"/>
         </w:numPr>
         <w:bidi w:val="0"/>
         <w:spacing w:before="0" w:after="240"/>
@@ -2250,6 +2169,7 @@
         </w:numPr>
         <w:bidi w:val="0"/>
         <w:spacing w:before="240" w:after="240"/>
+        <w:ind w:hanging="0" w:left="0"/>
         <w:jc w:val="left"/>
         <w:rPr/>
       </w:pPr>
@@ -2315,6 +2235,7 @@
         <w:pStyle w:val="Heading1"/>
         <w:bidi w:val="0"/>
         <w:spacing w:before="480" w:after="240"/>
+        <w:ind w:hanging="0" w:left="0"/>
         <w:jc w:val="left"/>
         <w:rPr/>
       </w:pPr>
@@ -2347,7 +2268,7 @@
         <w:pStyle w:val="ListParagraph"/>
         <w:numPr>
           <w:ilvl w:val="0"/>
-          <w:numId w:val="2"/>
+          <w:numId w:val="56"/>
         </w:numPr>
         <w:bidi w:val="0"/>
         <w:jc w:val="left"/>
@@ -2363,7 +2284,7 @@
         <w:pStyle w:val="ListParagraph"/>
         <w:numPr>
           <w:ilvl w:val="0"/>
-          <w:numId w:val="2"/>
+          <w:numId w:val="57"/>
         </w:numPr>
         <w:bidi w:val="0"/>
         <w:jc w:val="left"/>
@@ -2379,7 +2300,7 @@
         <w:pStyle w:val="ListParagraph"/>
         <w:numPr>
           <w:ilvl w:val="0"/>
-          <w:numId w:val="2"/>
+          <w:numId w:val="58"/>
         </w:numPr>
         <w:bidi w:val="0"/>
         <w:spacing w:before="0" w:after="240"/>
@@ -2415,7 +2336,7 @@
         <w:pStyle w:val="ListParagraph"/>
         <w:numPr>
           <w:ilvl w:val="0"/>
-          <w:numId w:val="2"/>
+          <w:numId w:val="59"/>
         </w:numPr>
         <w:bidi w:val="0"/>
         <w:jc w:val="left"/>
@@ -2431,7 +2352,7 @@
         <w:pStyle w:val="ListParagraph"/>
         <w:numPr>
           <w:ilvl w:val="0"/>
-          <w:numId w:val="2"/>
+          <w:numId w:val="60"/>
         </w:numPr>
         <w:bidi w:val="0"/>
         <w:spacing w:before="0" w:after="240"/>
@@ -2467,7 +2388,7 @@
         <w:pStyle w:val="ListParagraph"/>
         <w:numPr>
           <w:ilvl w:val="0"/>
-          <w:numId w:val="2"/>
+          <w:numId w:val="61"/>
         </w:numPr>
         <w:bidi w:val="0"/>
         <w:jc w:val="left"/>
@@ -2478,31 +2399,7 @@
           <w:rPr>
             <w:rStyle w:val="Hyperlink"/>
           </w:rPr>
-          <w:t>VJ Maharaja*, JV Senabea, RM Horakb</w:t>
-        </w:r>
-        <w:r>
-          <w:rPr>
-            <w:rStyle w:val="Hyperlink"/>
-          </w:rPr>
-          <w:t xml:space="preserve">a, </w:t>
-        </w:r>
-        <w:r>
-          <w:rPr>
-            <w:rStyle w:val="Hyperlink"/>
-          </w:rPr>
-          <w:t>Hoodia, a case study a</w:t>
-        </w:r>
-        <w:r>
-          <w:rPr>
-            <w:rStyle w:val="Hyperlink"/>
-          </w:rPr>
-          <w:t xml:space="preserve">t </w:t>
-        </w:r>
-        <w:r>
-          <w:rPr>
-            <w:rStyle w:val="Hyperlink"/>
-          </w:rPr>
-          <w:t>CSIR Biosciences</w:t>
+          <w:t>VJ Maharaja*, JV Senabea, RM Horakba, Hoodia, a case study at CSIR Biosciences</w:t>
         </w:r>
       </w:hyperlink>
     </w:p>
@@ -2527,7 +2424,7 @@
         <w:pStyle w:val="ListParagraph"/>
         <w:numPr>
           <w:ilvl w:val="0"/>
-          <w:numId w:val="2"/>
+          <w:numId w:val="62"/>
         </w:numPr>
         <w:bidi w:val="0"/>
         <w:spacing w:before="0" w:after="240"/>
@@ -2548,7 +2445,7 @@
         <w:pStyle w:val="Normal"/>
         <w:numPr>
           <w:ilvl w:val="0"/>
-          <w:numId w:val="2"/>
+          <w:numId w:val="63"/>
         </w:numPr>
         <w:bidi w:val="0"/>
         <w:jc w:val="left"/>
@@ -2609,7 +2506,7 @@
         <w:pStyle w:val="ListParagraph"/>
         <w:numPr>
           <w:ilvl w:val="0"/>
-          <w:numId w:val="2"/>
+          <w:numId w:val="64"/>
         </w:numPr>
         <w:bidi w:val="0"/>
         <w:jc w:val="left"/>
@@ -2645,7 +2542,7 @@
         <w:pStyle w:val="ListParagraph"/>
         <w:numPr>
           <w:ilvl w:val="0"/>
-          <w:numId w:val="2"/>
+          <w:numId w:val="65"/>
         </w:numPr>
         <w:bidi w:val="0"/>
         <w:jc w:val="left"/>
@@ -2685,7 +2582,7 @@
         <w:pStyle w:val="ListParagraph"/>
         <w:numPr>
           <w:ilvl w:val="0"/>
-          <w:numId w:val="2"/>
+          <w:numId w:val="66"/>
         </w:numPr>
         <w:bidi w:val="0"/>
         <w:jc w:val="left"/>
@@ -2721,7 +2618,7 @@
         <w:pStyle w:val="ListParagraph"/>
         <w:numPr>
           <w:ilvl w:val="0"/>
-          <w:numId w:val="2"/>
+          <w:numId w:val="67"/>
         </w:numPr>
         <w:bidi w:val="0"/>
         <w:jc w:val="left"/>
@@ -2753,7 +2650,7 @@
         <w:pStyle w:val="ListParagraph"/>
         <w:numPr>
           <w:ilvl w:val="0"/>
-          <w:numId w:val="2"/>
+          <w:numId w:val="68"/>
         </w:numPr>
         <w:bidi w:val="0"/>
         <w:jc w:val="left"/>
@@ -2782,274 +2679,658 @@
     </w:p>
     <w:p>
       <w:pPr>
-        <w:pStyle w:val="ListParagraph"/>
-        <w:bidi w:val="0"/>
-        <w:spacing w:before="0" w:after="240"/>
-        <w:jc w:val="left"/>
-        <w:rPr/>
-      </w:pPr>
-      <w:r>
-        <w:rPr/>
-      </w:r>
-    </w:p>
-    <w:p>
-      <w:pPr>
-        <w:pStyle w:val="ListParagraph"/>
-        <w:bidi w:val="0"/>
-        <w:spacing w:before="0" w:after="240"/>
-        <w:jc w:val="left"/>
-        <w:rPr/>
-      </w:pPr>
-      <w:r>
-        <w:rPr/>
-      </w:r>
-    </w:p>
-    <w:p>
-      <w:pPr>
-        <w:pStyle w:val="ListParagraph"/>
-        <w:bidi w:val="0"/>
-        <w:spacing w:before="0" w:after="240"/>
-        <w:jc w:val="left"/>
-        <w:rPr/>
-      </w:pPr>
-      <w:r>
-        <w:rPr/>
-      </w:r>
-    </w:p>
-    <w:p>
-      <w:pPr>
-        <w:pStyle w:val="ListParagraph"/>
-        <w:bidi w:val="0"/>
-        <w:spacing w:before="0" w:after="240"/>
-        <w:jc w:val="left"/>
-        <w:rPr/>
-      </w:pPr>
-      <w:r>
-        <w:rPr/>
-      </w:r>
-    </w:p>
-    <w:p>
-      <w:pPr>
-        <w:pStyle w:val="ListParagraph"/>
-        <w:bidi w:val="0"/>
-        <w:spacing w:before="0" w:after="240"/>
-        <w:jc w:val="left"/>
-        <w:rPr/>
-      </w:pPr>
-      <w:r>
-        <w:rPr/>
-      </w:r>
-    </w:p>
-    <w:p>
-      <w:pPr>
-        <w:pStyle w:val="ListParagraph"/>
-        <w:bidi w:val="0"/>
-        <w:spacing w:before="0" w:after="240"/>
-        <w:jc w:val="left"/>
-        <w:rPr/>
-      </w:pPr>
-      <w:r>
-        <w:rPr/>
-      </w:r>
-    </w:p>
-    <w:p>
-      <w:pPr>
-        <w:pStyle w:val="ListParagraph"/>
-        <w:bidi w:val="0"/>
-        <w:spacing w:before="0" w:after="240"/>
-        <w:jc w:val="left"/>
-        <w:rPr/>
-      </w:pPr>
-      <w:r>
-        <w:rPr/>
-      </w:r>
-    </w:p>
-    <w:p>
-      <w:pPr>
-        <w:pStyle w:val="ListParagraph"/>
-        <w:bidi w:val="0"/>
-        <w:spacing w:before="0" w:after="240"/>
-        <w:jc w:val="left"/>
-        <w:rPr/>
-      </w:pPr>
-      <w:r>
-        <w:rPr/>
-      </w:r>
-    </w:p>
-    <w:p>
-      <w:pPr>
-        <w:pStyle w:val="ListParagraph"/>
-        <w:bidi w:val="0"/>
-        <w:spacing w:before="0" w:after="240"/>
-        <w:jc w:val="left"/>
-        <w:rPr/>
-      </w:pPr>
-      <w:r>
-        <w:rPr/>
-      </w:r>
-    </w:p>
-    <w:p>
-      <w:pPr>
-        <w:pStyle w:val="ListParagraph"/>
-        <w:bidi w:val="0"/>
-        <w:spacing w:before="0" w:after="240"/>
-        <w:jc w:val="left"/>
-        <w:rPr/>
-      </w:pPr>
-      <w:r>
-        <w:rPr/>
-      </w:r>
-    </w:p>
-    <w:p>
-      <w:pPr>
-        <w:pStyle w:val="ListParagraph"/>
-        <w:bidi w:val="0"/>
-        <w:spacing w:before="0" w:after="240"/>
-        <w:jc w:val="left"/>
-        <w:rPr/>
-      </w:pPr>
-      <w:r>
-        <w:rPr/>
-      </w:r>
-    </w:p>
-    <w:p>
-      <w:pPr>
-        <w:pStyle w:val="ListParagraph"/>
-        <w:bidi w:val="0"/>
-        <w:spacing w:before="0" w:after="240"/>
-        <w:jc w:val="left"/>
-        <w:rPr/>
-      </w:pPr>
-      <w:r>
-        <w:rPr/>
-      </w:r>
-    </w:p>
-    <w:p>
-      <w:pPr>
-        <w:pStyle w:val="ListParagraph"/>
-        <w:bidi w:val="0"/>
-        <w:spacing w:before="0" w:after="240"/>
-        <w:jc w:val="left"/>
-        <w:rPr/>
-      </w:pPr>
-      <w:r>
-        <w:rPr/>
-      </w:r>
-    </w:p>
-    <w:p>
-      <w:pPr>
-        <w:pStyle w:val="ListParagraph"/>
-        <w:bidi w:val="0"/>
-        <w:spacing w:before="0" w:after="240"/>
-        <w:jc w:val="left"/>
-        <w:rPr/>
-      </w:pPr>
-      <w:r>
-        <w:rPr/>
-      </w:r>
-    </w:p>
-    <w:p>
-      <w:pPr>
-        <w:pStyle w:val="ListParagraph"/>
-        <w:bidi w:val="0"/>
-        <w:spacing w:before="0" w:after="240"/>
-        <w:jc w:val="left"/>
-        <w:rPr/>
-      </w:pPr>
-      <w:r>
-        <w:rPr/>
-      </w:r>
-    </w:p>
-    <w:p>
-      <w:pPr>
-        <w:pStyle w:val="ListParagraph"/>
-        <w:bidi w:val="0"/>
-        <w:spacing w:before="0" w:after="240"/>
-        <w:jc w:val="left"/>
-        <w:rPr/>
-      </w:pPr>
-      <w:r>
-        <w:rPr/>
-      </w:r>
-    </w:p>
-    <w:p>
-      <w:pPr>
-        <w:pStyle w:val="ListParagraph"/>
-        <w:bidi w:val="0"/>
-        <w:spacing w:before="0" w:after="240"/>
-        <w:jc w:val="left"/>
-        <w:rPr/>
-      </w:pPr>
-      <w:r>
-        <w:rPr/>
-      </w:r>
-    </w:p>
-    <w:p>
-      <w:pPr>
-        <w:pStyle w:val="ListParagraph"/>
-        <w:bidi w:val="0"/>
-        <w:spacing w:before="0" w:after="240"/>
-        <w:jc w:val="left"/>
-        <w:rPr/>
-      </w:pPr>
-      <w:r>
-        <w:rPr/>
-      </w:r>
-    </w:p>
-    <w:p>
-      <w:pPr>
-        <w:pStyle w:val="ListParagraph"/>
-        <w:bidi w:val="0"/>
-        <w:spacing w:before="0" w:after="240"/>
-        <w:jc w:val="left"/>
-        <w:rPr/>
-      </w:pPr>
-      <w:r>
-        <w:rPr/>
-      </w:r>
-    </w:p>
-    <w:p>
-      <w:pPr>
-        <w:pStyle w:val="ListParagraph"/>
-        <w:bidi w:val="0"/>
-        <w:spacing w:before="0" w:after="240"/>
-        <w:jc w:val="left"/>
-        <w:rPr/>
-      </w:pPr>
-      <w:r>
-        <w:rPr/>
-      </w:r>
-    </w:p>
-    <w:p>
-      <w:pPr>
-        <w:pStyle w:val="ListParagraph"/>
-        <w:bidi w:val="0"/>
-        <w:spacing w:before="0" w:after="240"/>
-        <w:jc w:val="left"/>
-        <w:rPr/>
-      </w:pPr>
-      <w:r>
-        <w:rPr/>
-      </w:r>
-    </w:p>
-    <w:p>
-      <w:pPr>
-        <w:pStyle w:val="ListParagraph"/>
-        <w:bidi w:val="0"/>
-        <w:spacing w:before="0" w:after="240"/>
-        <w:jc w:val="left"/>
-        <w:rPr/>
-      </w:pPr>
-      <w:r>
-        <w:rPr/>
-      </w:r>
-    </w:p>
-    <w:p>
-      <w:pPr>
-        <w:pStyle w:val="Normal"/>
-        <w:bidi w:val="0"/>
-        <w:spacing w:before="0" w:after="240"/>
-        <w:jc w:val="center"/>
+        <w:pStyle w:val="Normal"/>
+        <w:numPr>
+          <w:ilvl w:val="0"/>
+          <w:numId w:val="69"/>
+        </w:numPr>
+        <w:rPr/>
+      </w:pPr>
+      <w:bookmarkStart w:id="0" w:name="page-title"/>
+      <w:bookmarkEnd w:id="0"/>
+      <w:r>
+        <w:rPr>
+          <w:caps w:val="false"/>
+          <w:smallCaps w:val="false"/>
+        </w:rPr>
+        <w:t xml:space="preserve">A. </w:t>
+      </w:r>
+      <w:r>
+        <w:rPr>
+          <w:caps w:val="false"/>
+          <w:smallCaps w:val="false"/>
+        </w:rPr>
+        <w:t>Martins</w:t>
+      </w:r>
+      <w:r>
+        <w:rPr>
+          <w:caps w:val="false"/>
+          <w:smallCaps w:val="false"/>
+        </w:rPr>
+        <w:t>, A. V</w:t>
+      </w:r>
+      <w:r>
+        <w:rPr>
+          <w:caps w:val="false"/>
+          <w:smallCaps w:val="false"/>
+        </w:rPr>
+        <w:t>asas</w:t>
+      </w:r>
+      <w:r>
+        <w:rPr>
+          <w:caps w:val="false"/>
+          <w:smallCaps w:val="false"/>
+        </w:rPr>
+        <w:t>, ZS. S</w:t>
+      </w:r>
+      <w:r>
+        <w:rPr>
+          <w:caps w:val="false"/>
+          <w:smallCaps w:val="false"/>
+        </w:rPr>
+        <w:t>chelz</w:t>
+      </w:r>
+      <w:r>
+        <w:rPr>
+          <w:caps w:val="false"/>
+          <w:smallCaps w:val="false"/>
+        </w:rPr>
+        <w:t>, M. V</w:t>
+      </w:r>
+      <w:r>
+        <w:rPr>
+          <w:caps w:val="false"/>
+          <w:smallCaps w:val="false"/>
+        </w:rPr>
+        <w:t>ivieros</w:t>
+      </w:r>
+      <w:r>
+        <w:rPr>
+          <w:caps w:val="false"/>
+          <w:smallCaps w:val="false"/>
+        </w:rPr>
+        <w:t>, J. M</w:t>
+      </w:r>
+      <w:r>
+        <w:rPr>
+          <w:caps w:val="false"/>
+          <w:smallCaps w:val="false"/>
+        </w:rPr>
+        <w:t>olnar</w:t>
+      </w:r>
+      <w:r>
+        <w:rPr>
+          <w:caps w:val="false"/>
+          <w:smallCaps w:val="false"/>
+        </w:rPr>
+        <w:t>, J. H</w:t>
+      </w:r>
+      <w:r>
+        <w:rPr>
+          <w:caps w:val="false"/>
+          <w:smallCaps w:val="false"/>
+        </w:rPr>
+        <w:t>ohmann</w:t>
+      </w:r>
+      <w:r>
+        <w:rPr>
+          <w:caps w:val="false"/>
+          <w:smallCaps w:val="false"/>
+        </w:rPr>
+        <w:t xml:space="preserve"> And L. A</w:t>
+      </w:r>
+      <w:r>
+        <w:rPr>
+          <w:caps w:val="false"/>
+          <w:smallCaps w:val="false"/>
+        </w:rPr>
+        <w:t>maral</w:t>
+      </w:r>
+      <w:r>
+        <w:rPr>
+          <w:caps w:val="false"/>
+          <w:smallCaps w:val="false"/>
+        </w:rPr>
+        <w:t xml:space="preserve"> </w:t>
+      </w:r>
+      <w:r>
+        <w:rPr>
+          <w:caps w:val="false"/>
+          <w:smallCaps w:val="false"/>
+        </w:rPr>
+        <w:t>(2010),</w:t>
+      </w:r>
+      <w:r>
+        <w:rPr/>
+        <w:t xml:space="preserve"> </w:t>
+      </w:r>
+      <w:hyperlink r:id="rId9">
+        <w:r>
+          <w:rPr>
+            <w:rStyle w:val="Hyperlink"/>
+          </w:rPr>
+          <w:t xml:space="preserve">Constituents of </w:t>
+        </w:r>
+        <w:r>
+          <w:rPr>
+            <w:rStyle w:val="Hyperlink"/>
+            <w:i/>
+            <w:i/>
+            <w:iCs/>
+          </w:rPr>
+          <w:t>Carpobrotus edulis</w:t>
+        </w:r>
+        <w:r>
+          <w:rPr>
+            <w:rStyle w:val="Hyperlink"/>
+          </w:rPr>
+          <w:t xml:space="preserve"> Inhibit P-Glycoprotein of </w:t>
+        </w:r>
+        <w:r>
+          <w:rPr>
+            <w:rStyle w:val="Hyperlink"/>
+            <w:i/>
+            <w:i/>
+            <w:iCs/>
+          </w:rPr>
+          <w:t>MDR1</w:t>
+        </w:r>
+        <w:r>
+          <w:rPr>
+            <w:rStyle w:val="Hyperlink"/>
+          </w:rPr>
+          <w:t>-transfected Mouse Lymphoma Cells,</w:t>
+        </w:r>
+      </w:hyperlink>
+      <w:r>
+        <w:rPr/>
+        <w:t xml:space="preserve"> Anticancer Research March 2010, 30 (3) 829-835; </w:t>
+      </w:r>
+      <w:r>
+        <w:rPr/>
+        <w:t xml:space="preserve">[ refers to </w:t>
+      </w:r>
+      <w:r>
+        <w:rPr/>
+        <w:t>C. edulis is used in traditional medicine for the treatment of burns, stomach ailments, ulcerations of the mouth, toothache, oral and vaginal thrush, as well as bacterial infections, such as those affecting the lungs (tuberculosis), sinuses, and the colon (dysentery)</w:t>
+      </w:r>
+      <w:r>
+        <w:rPr/>
+        <w:t>]</w:t>
+      </w:r>
+    </w:p>
+    <w:p>
+      <w:pPr>
+        <w:pStyle w:val="Normal"/>
+        <w:numPr>
+          <w:ilvl w:val="0"/>
+          <w:numId w:val="0"/>
+        </w:numPr>
+        <w:ind w:hanging="0" w:left="720"/>
+        <w:rPr/>
+      </w:pPr>
+      <w:r>
+        <w:rPr/>
+      </w:r>
+    </w:p>
+    <w:p>
+      <w:pPr>
+        <w:pStyle w:val="Normal"/>
+        <w:numPr>
+          <w:ilvl w:val="0"/>
+          <w:numId w:val="0"/>
+        </w:numPr>
+        <w:ind w:hanging="0" w:left="720"/>
+        <w:rPr/>
+      </w:pPr>
+      <w:r>
+        <w:rPr/>
+        <w:t xml:space="preserve">Semenya, Sebua Silas; Maroyi, Alfred </w:t>
+      </w:r>
+      <w:r>
+        <w:rPr/>
+        <w:t xml:space="preserve">(2018) </w:t>
+      </w:r>
+      <w:hyperlink r:id="rId10">
+        <w:r>
+          <w:rPr>
+            <w:rStyle w:val="Hyperlink"/>
+          </w:rPr>
+          <w:t>Therapeutic plants used by traditional health practitioners to treat pneumonia in the Limpopo Province, South Africa</w:t>
+        </w:r>
+      </w:hyperlink>
+      <w:r>
+        <w:rPr/>
+        <w:t xml:space="preserve">. BOLETÍN LATINO AMERICANO Y DEL CARIBE </w:t>
+      </w:r>
+      <w:r>
+        <w:rPr/>
+        <w:t>DE PLANTAS MEDICINALES Y AROMÁTICAS 17 (6): 583 - 603 (2018) [Details use by BaPedi traditional healers to treat pneumonia, chewed orally as raw and juice as swallowed thrice daily]</w:t>
+      </w:r>
+    </w:p>
+    <w:p>
+      <w:pPr>
+        <w:pStyle w:val="Normal"/>
+        <w:numPr>
+          <w:ilvl w:val="0"/>
+          <w:numId w:val="0"/>
+        </w:numPr>
+        <w:ind w:hanging="0" w:left="720"/>
+        <w:rPr/>
+      </w:pPr>
+      <w:r>
+        <w:rPr/>
+      </w:r>
+    </w:p>
+    <w:p>
+      <w:pPr>
+        <w:pStyle w:val="Normal"/>
+        <w:numPr>
+          <w:ilvl w:val="0"/>
+          <w:numId w:val="70"/>
+        </w:numPr>
+        <w:rPr/>
+      </w:pPr>
+      <w:r>
+        <w:rPr/>
+        <w:t xml:space="preserve">Sebua Silas Semenya &amp; Alfred Maroyi </w:t>
+      </w:r>
+      <w:r>
+        <w:rPr/>
+        <w:t xml:space="preserve">(2018) </w:t>
+      </w:r>
+      <w:r>
+        <w:rPr/>
+        <w:t xml:space="preserve">Exotic plants used therapeutically by Bapedi traditional healers for respiratory infections and related symptoms in the Limpopo province, South Africa,  </w:t>
+      </w:r>
+      <w:r>
+        <w:rPr/>
+        <w:t>I</w:t>
+      </w:r>
+      <w:r>
+        <w:rPr/>
+        <w:t>ndian Journal of Traditional Knowledge</w:t>
+      </w:r>
+    </w:p>
+    <w:p>
+      <w:pPr>
+        <w:pStyle w:val="Normal"/>
+        <w:numPr>
+          <w:ilvl w:val="0"/>
+          <w:numId w:val="71"/>
+        </w:numPr>
+        <w:rPr/>
+      </w:pPr>
+      <w:r>
+        <w:rPr/>
+        <w:t>Vol. 17(4), October 2018, pp. 663-671</w:t>
+      </w:r>
+    </w:p>
+    <w:p>
+      <w:pPr>
+        <w:pStyle w:val="Normal"/>
+        <w:numPr>
+          <w:ilvl w:val="0"/>
+          <w:numId w:val="0"/>
+        </w:numPr>
+        <w:ind w:hanging="0" w:left="720"/>
+        <w:rPr/>
+      </w:pPr>
+      <w:r>
+        <w:rPr/>
+      </w:r>
+    </w:p>
+    <w:p>
+      <w:pPr>
+        <w:pStyle w:val="Normal"/>
+        <w:numPr>
+          <w:ilvl w:val="0"/>
+          <w:numId w:val="72"/>
+        </w:numPr>
+        <w:rPr/>
+      </w:pPr>
+      <w:r>
+        <w:rPr/>
+        <w:t xml:space="preserve">Beauty E Omoruyi, Graeme Bradley &amp;  Anthony J Afolayan </w:t>
+      </w:r>
+      <w:r>
+        <w:rPr/>
+        <w:t xml:space="preserve">(2012) </w:t>
+      </w:r>
+      <w:hyperlink r:id="rId11">
+        <w:r>
+          <w:rPr>
+            <w:rStyle w:val="Hyperlink"/>
+          </w:rPr>
+          <w:t xml:space="preserve">Antioxidant and phytochemical properties of </w:t>
+        </w:r>
+        <w:r>
+          <w:rPr>
+            <w:rStyle w:val="Hyperlink"/>
+            <w:i/>
+          </w:rPr>
+          <w:t>Carpobrotus edulis</w:t>
+        </w:r>
+        <w:r>
+          <w:rPr>
+            <w:rStyle w:val="Hyperlink"/>
+          </w:rPr>
+          <w:t xml:space="preserve"> (L.) bolus leaf used for the management of common infections in HIV/AIDS patients in Eastern Cape Province</w:t>
+        </w:r>
+      </w:hyperlink>
+      <w:r>
+        <w:rPr/>
+        <w:t xml:space="preserve">, </w:t>
+      </w:r>
+      <w:bookmarkStart w:id="1" w:name="breadcrumb0"/>
+      <w:bookmarkStart w:id="2" w:name="breadcrumb1"/>
+      <w:bookmarkEnd w:id="1"/>
+      <w:bookmarkEnd w:id="2"/>
+      <w:r>
+        <w:rPr/>
+        <w:t xml:space="preserve">BMC Complementary and Alternative Medicine </w:t>
+      </w:r>
+      <w:r>
+        <w:rPr/>
+        <w:t>12:215 [Details traditional medicinal use for common infections related to HIV in Eastern Cape, demonstrates anti-oxidant effects</w:t>
+      </w:r>
+      <w:r>
+        <w:rPr/>
+        <w:t>]</w:t>
+      </w:r>
+    </w:p>
+    <w:p>
+      <w:pPr>
+        <w:pStyle w:val="Normal"/>
+        <w:numPr>
+          <w:ilvl w:val="0"/>
+          <w:numId w:val="0"/>
+        </w:numPr>
+        <w:ind w:hanging="0" w:left="720"/>
+        <w:rPr/>
+      </w:pPr>
+      <w:r>
+        <w:rPr/>
+      </w:r>
+    </w:p>
+    <w:p>
+      <w:pPr>
+        <w:pStyle w:val="Normal"/>
+        <w:numPr>
+          <w:ilvl w:val="0"/>
+          <w:numId w:val="73"/>
+        </w:numPr>
+        <w:rPr/>
+      </w:pPr>
+      <w:bookmarkStart w:id="3" w:name="a1_Ctrl"/>
+      <w:bookmarkEnd w:id="3"/>
+      <w:r>
+        <w:rPr/>
+        <w:t>I. O. Lawal, </w:t>
+      </w:r>
+      <w:bookmarkStart w:id="4" w:name="a2_Ctrl"/>
+      <w:bookmarkEnd w:id="4"/>
+      <w:r>
+        <w:rPr/>
+        <w:t>D. S. Grierson, </w:t>
+      </w:r>
+      <w:bookmarkStart w:id="5" w:name="a3_Ctrl"/>
+      <w:bookmarkEnd w:id="5"/>
+      <w:r>
+        <w:rPr/>
+        <w:t xml:space="preserve">A. J. Afolayan. </w:t>
+      </w:r>
+      <w:r>
+        <w:rPr/>
+        <w:t xml:space="preserve">(2014) </w:t>
+      </w:r>
+      <w:hyperlink r:id="rId12">
+        <w:r>
+          <w:rPr>
+            <w:rStyle w:val="Hyperlink"/>
+          </w:rPr>
+          <w:t>Phytotherapeutic Information on Plants Used for the Treatment of Tuberculosis in Eastern Cape Province, South Africa</w:t>
+        </w:r>
+      </w:hyperlink>
+      <w:r>
+        <w:rPr/>
+        <w:t xml:space="preserve">, </w:t>
+      </w:r>
+      <w:r>
+        <w:rPr/>
+        <w:t>Evidence-Based Complementary and Alternative Medicine, volume 2014 [</w:t>
+      </w:r>
+      <w:r>
+        <w:rPr>
+          <w:i w:val="false"/>
+          <w:iCs w:val="false"/>
+        </w:rPr>
+        <w:t>Carpobrotus edulis</w:t>
+      </w:r>
+      <w:r>
+        <w:rPr>
+          <w:i w:val="false"/>
+          <w:iCs w:val="false"/>
+        </w:rPr>
+        <w:t xml:space="preserve"> frequently mentioned by tradtional healers in treatment of TB]</w:t>
+      </w:r>
+    </w:p>
+    <w:p>
+      <w:pPr>
+        <w:pStyle w:val="Normal"/>
+        <w:numPr>
+          <w:ilvl w:val="0"/>
+          <w:numId w:val="0"/>
+        </w:numPr>
+        <w:ind w:hanging="0" w:left="720"/>
+        <w:rPr>
+          <w:i w:val="false"/>
+          <w:i w:val="false"/>
+          <w:iCs w:val="false"/>
+        </w:rPr>
+      </w:pPr>
+      <w:r>
+        <w:rPr/>
+      </w:r>
+    </w:p>
+    <w:p>
+      <w:pPr>
+        <w:pStyle w:val="Normal"/>
+        <w:numPr>
+          <w:ilvl w:val="0"/>
+          <w:numId w:val="74"/>
+        </w:numPr>
+        <w:rPr/>
+      </w:pPr>
+      <w:r>
+        <w:rPr/>
+        <w:t xml:space="preserve">Akinyede, K. A., Ekpo, O. E., &amp; Oguntibeju, O. O. (2020). </w:t>
+      </w:r>
+      <w:hyperlink r:id="rId13">
+        <w:r>
+          <w:rPr>
+            <w:rStyle w:val="Hyperlink"/>
+          </w:rPr>
+          <w:t>Ethnopharmacology, Therapeutic Properties and Nutritional Potentials of Carpobrotus edulis: A Comprehensive Review. Scientia Pharmaceutica,</w:t>
+        </w:r>
+      </w:hyperlink>
+      <w:r>
+        <w:rPr/>
+        <w:t xml:space="preserve"> 88(3), 39.  [</w:t>
+      </w:r>
+      <w:r>
+        <w:rPr/>
+        <w:t>C. edulis enormous importance for the treatment of many disease conditions. The juice and sap from C. edulis leaves are traditionally used to treat throat and mouth infections [28], dysentery [29] and digestive problems [28,29], tuberculosis [28], and skin conditions such as burns and wounds as well as for the management of common infections in HIV/AIDS [1]. These authors have also reported the use of C. edulis for the treatment of toothache, earache, oral thrush, virginal thrush, blood pressure, and diabetes mellitus [1]. C. edulis has also been reported to play an important role as a traditional food additive to improve the nutrient composition of food, as its edible fleshy shoot when soaked in water and well-prepared has been used as a food preservative</w:t>
+      </w:r>
+      <w:r>
+        <w:rPr/>
+        <w:t>]</w:t>
+      </w:r>
+    </w:p>
+    <w:p>
+      <w:pPr>
+        <w:pStyle w:val="Normal"/>
+        <w:rPr/>
+      </w:pPr>
+      <w:r>
+        <w:rPr/>
+      </w:r>
+    </w:p>
+    <w:p>
+      <w:pPr>
+        <w:pStyle w:val="Normal"/>
+        <w:rPr>
+          <w:b/>
+          <w:bCs/>
+        </w:rPr>
+      </w:pPr>
+      <w:r>
+        <w:rPr>
+          <w:b/>
+          <w:bCs/>
+        </w:rPr>
+        <w:t>Scientific studies detailing potential applications of C Edulis</w:t>
+      </w:r>
+    </w:p>
+    <w:p>
+      <w:pPr>
+        <w:pStyle w:val="Normal"/>
+        <w:numPr>
+          <w:ilvl w:val="0"/>
+          <w:numId w:val="0"/>
+        </w:numPr>
+        <w:ind w:hanging="0" w:left="720"/>
+        <w:rPr/>
+      </w:pPr>
+      <w:r>
+        <w:rPr/>
+      </w:r>
+    </w:p>
+    <w:p>
+      <w:pPr>
+        <w:pStyle w:val="Normal"/>
+        <w:numPr>
+          <w:ilvl w:val="0"/>
+          <w:numId w:val="75"/>
+        </w:numPr>
+        <w:rPr/>
+      </w:pPr>
+      <w:r>
+        <w:rPr/>
+        <w:t xml:space="preserve">Marques, C. R., Sousa, C., Moutinho, C., Matos, C., &amp; Vinha, A. F. (2025). </w:t>
+      </w:r>
+      <w:hyperlink r:id="rId14">
+        <w:r>
+          <w:rPr>
+            <w:rStyle w:val="Hyperlink"/>
+          </w:rPr>
+          <w:t>Characterization of Dietary Constituents, Phytochemicals, and Antioxidant Capacity of Carpobrotus edulis Fruit: Potential Application in Nutrition.</w:t>
+        </w:r>
+      </w:hyperlink>
+      <w:r>
+        <w:rPr/>
+        <w:t xml:space="preserve"> Applied Sciences, 15(10), 5599. </w:t>
+      </w:r>
+      <w:r>
+        <w:rPr/>
+        <w:t>[</w:t>
+      </w:r>
+      <w:r>
+        <w:rPr/>
+        <w:t>C. edulis is widely recognized as a culinary and medicinal plant [3,4]. This species has traditionally been regarded as an edible plant [5], consumed either raw or as processed food, like jams and jellies. Also, its leaves are used as a vegetable, and its sweet and peppery fruits are also consumed. Other applications of C. edulis have been described, such as natural additives (to add flavor) or as food preservatives [3,6]. Also, several studies have shown that C. edulis possesses various bioactive compounds that perform a range of biological functions, including antioxidant, enzymatic inhibition [7], antibacterial and antifungal [8,9], antiproliferative [10], anti-HIV [11], and neuroprotective properties [12]. Flavonoids like catechin, epicatechin, rutin, and luteolin and phenolic acids such as chlorogenic and sinapic acids are the most common phytoconstituents described in this species, followed by procyanidins, coumarins, terpenoids (amyrin, oleanolic acid, and uvaol), and alkaloids [2,13]. These compounds have great importance in the food industry, such as vanillin, a flavoring with relevant bioactive properties (antioxidant, antimicrobial, and neuroprotective) [7]; uvaol, which has antitumoral activities that can enhance its use as a nutraceutical [14]; tannins, thanks to their antiseptic, antibacterial, antioxidant, anticarcinogenic, and anti-inflammatory properties, which make them suitable for use as nutraceuticals and as food preservatives [15]; and procyanidins, which can be used as natural food dyes, being at the same time intestinal epithelial cell protectors, among other important bioactivities [16]. In addition to these examples, it should be noted that many of these compounds are tyrosinase inhibitors, which makes them have great potential in industrial applications, thanks to their ability to prevent food enzymatic browning, thus avoiding nutritional and economic losses during the storage period</w:t>
+      </w:r>
+      <w:r>
+        <w:rPr/>
+        <w:t>]</w:t>
+      </w:r>
+    </w:p>
+    <w:p>
+      <w:pPr>
+        <w:pStyle w:val="Normal"/>
+        <w:rPr/>
+      </w:pPr>
+      <w:r>
+        <w:rPr/>
+      </w:r>
+    </w:p>
+    <w:p>
+      <w:pPr>
+        <w:pStyle w:val="ListParagraph"/>
+        <w:bidi w:val="0"/>
+        <w:spacing w:before="0" w:after="240"/>
+        <w:jc w:val="left"/>
+        <w:rPr/>
+      </w:pPr>
+      <w:r>
+        <w:rPr/>
+      </w:r>
+    </w:p>
+    <w:p>
+      <w:pPr>
+        <w:pStyle w:val="ListParagraph"/>
+        <w:bidi w:val="0"/>
+        <w:spacing w:before="0" w:after="240"/>
+        <w:jc w:val="left"/>
+        <w:rPr/>
+      </w:pPr>
+      <w:r>
+        <w:rPr/>
+      </w:r>
+    </w:p>
+    <w:p>
+      <w:pPr>
+        <w:pStyle w:val="ListParagraph"/>
+        <w:bidi w:val="0"/>
+        <w:spacing w:before="0" w:after="240"/>
+        <w:jc w:val="left"/>
+        <w:rPr/>
+      </w:pPr>
+      <w:r>
+        <w:rPr/>
+      </w:r>
+    </w:p>
+    <w:p>
+      <w:pPr>
+        <w:pStyle w:val="ListParagraph"/>
+        <w:bidi w:val="0"/>
+        <w:spacing w:before="0" w:after="240"/>
+        <w:jc w:val="left"/>
+        <w:rPr/>
+      </w:pPr>
+      <w:r>
+        <w:rPr/>
+      </w:r>
+    </w:p>
+    <w:p>
+      <w:pPr>
+        <w:pStyle w:val="ListParagraph"/>
+        <w:bidi w:val="0"/>
+        <w:spacing w:before="0" w:after="240"/>
+        <w:jc w:val="left"/>
+        <w:rPr/>
+      </w:pPr>
+      <w:r>
+        <w:rPr/>
+      </w:r>
+    </w:p>
+    <w:p>
+      <w:pPr>
+        <w:pStyle w:val="ListParagraph"/>
+        <w:bidi w:val="0"/>
+        <w:spacing w:before="0" w:after="240"/>
+        <w:jc w:val="left"/>
+        <w:rPr/>
+      </w:pPr>
+      <w:r>
+        <w:rPr/>
+      </w:r>
+    </w:p>
+    <w:p>
+      <w:pPr>
+        <w:pStyle w:val="ListParagraph"/>
+        <w:bidi w:val="0"/>
+        <w:spacing w:before="0" w:after="240"/>
+        <w:jc w:val="left"/>
         <w:rPr>
           <w:rFonts w:ascii="Arial" w:hAnsi="Arial" w:eastAsia="Arial" w:cs="Arial"/>
           <w:b/>
@@ -3059,7 +3340,13 @@
         </w:rPr>
       </w:pPr>
       <w:r>
-        <w:rPr/>
+        <w:rPr>
+          <w:rFonts w:eastAsia="Arial" w:cs="Arial"/>
+          <w:b/>
+          <w:bCs/>
+          <w:sz w:val="32"/>
+          <w:szCs w:val="32"/>
+        </w:rPr>
       </w:r>
     </w:p>
     <w:p>
@@ -3126,6 +3413,7 @@
       <w:pPr>
         <w:pStyle w:val="Heading1"/>
         <w:bidi w:val="0"/>
+        <w:ind w:hanging="0" w:left="0"/>
         <w:jc w:val="left"/>
         <w:rPr/>
       </w:pPr>
@@ -3162,6 +3450,7 @@
       <w:pPr>
         <w:pStyle w:val="Heading1"/>
         <w:bidi w:val="0"/>
+        <w:ind w:hanging="0" w:left="0"/>
         <w:jc w:val="left"/>
         <w:rPr/>
       </w:pPr>
@@ -3174,6 +3463,7 @@
       <w:pPr>
         <w:pStyle w:val="Heading2"/>
         <w:bidi w:val="0"/>
+        <w:ind w:hanging="0" w:left="0"/>
         <w:jc w:val="left"/>
         <w:rPr/>
       </w:pPr>
@@ -3181,7 +3471,7 @@
         <w:rPr/>
         <w:t xml:space="preserve">2007: </w:t>
       </w:r>
-      <w:hyperlink r:id="rId9">
+      <w:hyperlink r:id="rId15">
         <w:r>
           <w:rPr>
             <w:rStyle w:val="Hyperlink"/>
@@ -3195,7 +3485,7 @@
         <w:pStyle w:val="ListParagraph"/>
         <w:numPr>
           <w:ilvl w:val="0"/>
-          <w:numId w:val="4"/>
+          <w:numId w:val="76"/>
         </w:numPr>
         <w:bidi w:val="0"/>
         <w:jc w:val="left"/>
@@ -3211,7 +3501,7 @@
         <w:pStyle w:val="ListParagraph"/>
         <w:numPr>
           <w:ilvl w:val="0"/>
-          <w:numId w:val="2"/>
+          <w:numId w:val="77"/>
         </w:numPr>
         <w:bidi w:val="0"/>
         <w:jc w:val="left"/>
@@ -3227,7 +3517,7 @@
         <w:pStyle w:val="ListParagraph"/>
         <w:numPr>
           <w:ilvl w:val="0"/>
-          <w:numId w:val="2"/>
+          <w:numId w:val="78"/>
         </w:numPr>
         <w:bidi w:val="0"/>
         <w:jc w:val="left"/>
@@ -3243,7 +3533,7 @@
         <w:pStyle w:val="ListParagraph"/>
         <w:numPr>
           <w:ilvl w:val="0"/>
-          <w:numId w:val="2"/>
+          <w:numId w:val="79"/>
         </w:numPr>
         <w:bidi w:val="0"/>
         <w:spacing w:before="0" w:after="240"/>
@@ -3260,7 +3550,7 @@
         <w:pStyle w:val="ListParagraph"/>
         <w:numPr>
           <w:ilvl w:val="0"/>
-          <w:numId w:val="2"/>
+          <w:numId w:val="80"/>
         </w:numPr>
         <w:bidi w:val="0"/>
         <w:spacing w:before="0" w:after="240"/>
@@ -3291,6 +3581,7 @@
       <w:pPr>
         <w:pStyle w:val="Heading2"/>
         <w:bidi w:val="0"/>
+        <w:ind w:hanging="0" w:left="0"/>
         <w:jc w:val="left"/>
         <w:rPr/>
       </w:pPr>
@@ -3298,7 +3589,7 @@
         <w:rPr/>
         <w:t xml:space="preserve">2013-2015: </w:t>
       </w:r>
-      <w:hyperlink r:id="rId10">
+      <w:hyperlink r:id="rId16">
         <w:r>
           <w:rPr>
             <w:rStyle w:val="Hyperlink"/>
@@ -3312,7 +3603,7 @@
         <w:pStyle w:val="ListParagraph"/>
         <w:numPr>
           <w:ilvl w:val="0"/>
-          <w:numId w:val="2"/>
+          <w:numId w:val="81"/>
         </w:numPr>
         <w:bidi w:val="0"/>
         <w:jc w:val="left"/>
@@ -3328,7 +3619,7 @@
         <w:pStyle w:val="ListParagraph"/>
         <w:numPr>
           <w:ilvl w:val="0"/>
-          <w:numId w:val="2"/>
+          <w:numId w:val="82"/>
         </w:numPr>
         <w:bidi w:val="0"/>
         <w:jc w:val="left"/>
@@ -3344,7 +3635,7 @@
         <w:pStyle w:val="ListParagraph"/>
         <w:numPr>
           <w:ilvl w:val="0"/>
-          <w:numId w:val="2"/>
+          <w:numId w:val="83"/>
         </w:numPr>
         <w:bidi w:val="0"/>
         <w:jc w:val="left"/>
@@ -3360,7 +3651,7 @@
         <w:pStyle w:val="ListParagraph"/>
         <w:numPr>
           <w:ilvl w:val="0"/>
-          <w:numId w:val="2"/>
+          <w:numId w:val="84"/>
         </w:numPr>
         <w:bidi w:val="0"/>
         <w:jc w:val="left"/>
@@ -3376,7 +3667,7 @@
         <w:pStyle w:val="ListParagraph"/>
         <w:numPr>
           <w:ilvl w:val="0"/>
-          <w:numId w:val="2"/>
+          <w:numId w:val="85"/>
         </w:numPr>
         <w:bidi w:val="0"/>
         <w:jc w:val="left"/>
@@ -3392,7 +3683,7 @@
         <w:pStyle w:val="ListParagraph"/>
         <w:numPr>
           <w:ilvl w:val="0"/>
-          <w:numId w:val="2"/>
+          <w:numId w:val="86"/>
         </w:numPr>
         <w:bidi w:val="0"/>
         <w:spacing w:before="0" w:after="240"/>
@@ -3408,6 +3699,7 @@
       <w:pPr>
         <w:pStyle w:val="Heading2"/>
         <w:bidi w:val="0"/>
+        <w:ind w:hanging="0" w:left="0"/>
         <w:jc w:val="left"/>
         <w:rPr/>
       </w:pPr>
@@ -3433,6 +3725,7 @@
       <w:pPr>
         <w:pStyle w:val="Heading1"/>
         <w:bidi w:val="0"/>
+        <w:ind w:hanging="0" w:left="0"/>
         <w:jc w:val="left"/>
         <w:rPr/>
       </w:pPr>
@@ -3445,6 +3738,7 @@
       <w:pPr>
         <w:pStyle w:val="Heading2"/>
         <w:bidi w:val="0"/>
+        <w:ind w:hanging="0" w:left="0"/>
         <w:jc w:val="left"/>
         <w:rPr/>
       </w:pPr>
@@ -3470,6 +3764,7 @@
       <w:pPr>
         <w:pStyle w:val="Heading2"/>
         <w:bidi w:val="0"/>
+        <w:ind w:hanging="0" w:left="0"/>
         <w:jc w:val="left"/>
         <w:rPr/>
       </w:pPr>
@@ -3495,6 +3790,7 @@
       <w:pPr>
         <w:pStyle w:val="Heading2"/>
         <w:bidi w:val="0"/>
+        <w:ind w:hanging="0" w:left="0"/>
         <w:jc w:val="left"/>
         <w:rPr/>
       </w:pPr>
@@ -3520,6 +3816,7 @@
       <w:pPr>
         <w:pStyle w:val="Heading1"/>
         <w:bidi w:val="0"/>
+        <w:ind w:hanging="0" w:left="0"/>
         <w:jc w:val="left"/>
         <w:rPr/>
       </w:pPr>
@@ -3549,7 +3846,7 @@
         <w:pStyle w:val="ListParagraph"/>
         <w:numPr>
           <w:ilvl w:val="0"/>
-          <w:numId w:val="2"/>
+          <w:numId w:val="87"/>
         </w:numPr>
         <w:bidi w:val="0"/>
         <w:jc w:val="left"/>
@@ -3565,7 +3862,7 @@
         <w:pStyle w:val="ListParagraph"/>
         <w:numPr>
           <w:ilvl w:val="0"/>
-          <w:numId w:val="2"/>
+          <w:numId w:val="88"/>
         </w:numPr>
         <w:bidi w:val="0"/>
         <w:jc w:val="left"/>
@@ -3581,7 +3878,7 @@
         <w:pStyle w:val="ListParagraph"/>
         <w:numPr>
           <w:ilvl w:val="0"/>
-          <w:numId w:val="2"/>
+          <w:numId w:val="89"/>
         </w:numPr>
         <w:bidi w:val="0"/>
         <w:jc w:val="left"/>
@@ -3597,7 +3894,7 @@
         <w:pStyle w:val="ListParagraph"/>
         <w:numPr>
           <w:ilvl w:val="0"/>
-          <w:numId w:val="2"/>
+          <w:numId w:val="90"/>
         </w:numPr>
         <w:bidi w:val="0"/>
         <w:spacing w:before="0" w:after="240"/>
@@ -3613,6 +3910,7 @@
       <w:pPr>
         <w:pStyle w:val="Heading1"/>
         <w:bidi w:val="0"/>
+        <w:ind w:hanging="0" w:left="0"/>
         <w:jc w:val="left"/>
         <w:rPr/>
       </w:pPr>
@@ -3626,7 +3924,7 @@
         <w:pStyle w:val="ListParagraph"/>
         <w:numPr>
           <w:ilvl w:val="0"/>
-          <w:numId w:val="2"/>
+          <w:numId w:val="91"/>
         </w:numPr>
         <w:bidi w:val="0"/>
         <w:jc w:val="left"/>
@@ -3665,7 +3963,7 @@
         <w:pStyle w:val="ListParagraph"/>
         <w:numPr>
           <w:ilvl w:val="0"/>
-          <w:numId w:val="2"/>
+          <w:numId w:val="92"/>
         </w:numPr>
         <w:bidi w:val="0"/>
         <w:jc w:val="left"/>
@@ -3704,7 +4002,7 @@
         <w:pStyle w:val="ListParagraph"/>
         <w:numPr>
           <w:ilvl w:val="0"/>
-          <w:numId w:val="2"/>
+          <w:numId w:val="93"/>
         </w:numPr>
         <w:bidi w:val="0"/>
         <w:spacing w:before="0" w:after="240"/>
@@ -3727,6 +4025,7 @@
       <w:pPr>
         <w:pStyle w:val="Heading1"/>
         <w:bidi w:val="0"/>
+        <w:ind w:hanging="0" w:left="0"/>
         <w:jc w:val="left"/>
         <w:rPr/>
       </w:pPr>
@@ -3777,125 +4076,6 @@
   <w:abstractNum w:abstractNumId="1">
     <w:lvl w:ilvl="0">
       <w:start w:val="1"/>
-      <w:numFmt w:val="none"/>
-      <w:suff w:val="nothing"/>
-      <w:lvlText w:val="%1"/>
-      <w:lvlJc w:val="left"/>
-      <w:pPr>
-        <w:tabs>
-          <w:tab w:val="num" w:pos="0"/>
-        </w:tabs>
-        <w:ind w:left="0" w:hanging="0"/>
-      </w:pPr>
-    </w:lvl>
-    <w:lvl w:ilvl="1">
-      <w:start w:val="1"/>
-      <w:numFmt w:val="none"/>
-      <w:suff w:val="nothing"/>
-      <w:lvlText w:val="%2"/>
-      <w:lvlJc w:val="left"/>
-      <w:pPr>
-        <w:tabs>
-          <w:tab w:val="num" w:pos="0"/>
-        </w:tabs>
-        <w:ind w:left="0" w:hanging="0"/>
-      </w:pPr>
-    </w:lvl>
-    <w:lvl w:ilvl="2">
-      <w:start w:val="1"/>
-      <w:numFmt w:val="none"/>
-      <w:suff w:val="nothing"/>
-      <w:lvlText w:val="%3"/>
-      <w:lvlJc w:val="left"/>
-      <w:pPr>
-        <w:tabs>
-          <w:tab w:val="num" w:pos="0"/>
-        </w:tabs>
-        <w:ind w:left="0" w:hanging="0"/>
-      </w:pPr>
-    </w:lvl>
-    <w:lvl w:ilvl="3">
-      <w:start w:val="1"/>
-      <w:numFmt w:val="none"/>
-      <w:suff w:val="nothing"/>
-      <w:lvlText w:val="%4"/>
-      <w:lvlJc w:val="left"/>
-      <w:pPr>
-        <w:tabs>
-          <w:tab w:val="num" w:pos="0"/>
-        </w:tabs>
-        <w:ind w:left="0" w:hanging="0"/>
-      </w:pPr>
-    </w:lvl>
-    <w:lvl w:ilvl="4">
-      <w:start w:val="1"/>
-      <w:numFmt w:val="none"/>
-      <w:suff w:val="nothing"/>
-      <w:lvlText w:val="%5"/>
-      <w:lvlJc w:val="left"/>
-      <w:pPr>
-        <w:tabs>
-          <w:tab w:val="num" w:pos="0"/>
-        </w:tabs>
-        <w:ind w:left="0" w:hanging="0"/>
-      </w:pPr>
-    </w:lvl>
-    <w:lvl w:ilvl="5">
-      <w:start w:val="1"/>
-      <w:numFmt w:val="none"/>
-      <w:suff w:val="nothing"/>
-      <w:lvlText w:val="%6"/>
-      <w:lvlJc w:val="left"/>
-      <w:pPr>
-        <w:tabs>
-          <w:tab w:val="num" w:pos="0"/>
-        </w:tabs>
-        <w:ind w:left="0" w:hanging="0"/>
-      </w:pPr>
-    </w:lvl>
-    <w:lvl w:ilvl="6">
-      <w:start w:val="1"/>
-      <w:numFmt w:val="none"/>
-      <w:suff w:val="nothing"/>
-      <w:lvlText w:val="%7"/>
-      <w:lvlJc w:val="left"/>
-      <w:pPr>
-        <w:tabs>
-          <w:tab w:val="num" w:pos="0"/>
-        </w:tabs>
-        <w:ind w:left="0" w:hanging="0"/>
-      </w:pPr>
-    </w:lvl>
-    <w:lvl w:ilvl="7">
-      <w:start w:val="1"/>
-      <w:numFmt w:val="none"/>
-      <w:suff w:val="nothing"/>
-      <w:lvlText w:val="%8"/>
-      <w:lvlJc w:val="left"/>
-      <w:pPr>
-        <w:tabs>
-          <w:tab w:val="num" w:pos="0"/>
-        </w:tabs>
-        <w:ind w:left="0" w:hanging="0"/>
-      </w:pPr>
-    </w:lvl>
-    <w:lvl w:ilvl="8">
-      <w:start w:val="1"/>
-      <w:numFmt w:val="none"/>
-      <w:suff w:val="nothing"/>
-      <w:lvlText w:val="%9"/>
-      <w:lvlJc w:val="left"/>
-      <w:pPr>
-        <w:tabs>
-          <w:tab w:val="num" w:pos="0"/>
-        </w:tabs>
-        <w:ind w:left="0" w:hanging="0"/>
-      </w:pPr>
-    </w:lvl>
-  </w:abstractNum>
-  <w:abstractNum w:abstractNumId="2">
-    <w:lvl w:ilvl="0">
-      <w:start w:val="1"/>
       <w:numFmt w:val="bullet"/>
       <w:lvlText w:val=""/>
       <w:lvlJc w:val="left"/>
@@ -3920,6 +4100,7 @@
         </w:tabs>
         <w:ind w:left="1080" w:hanging="360"/>
       </w:pPr>
+      <w:rPr/>
     </w:lvl>
     <w:lvl w:ilvl="2">
       <w:start w:val="1"/>
@@ -3932,6 +4113,7 @@
         </w:tabs>
         <w:ind w:left="1440" w:hanging="360"/>
       </w:pPr>
+      <w:rPr/>
     </w:lvl>
     <w:lvl w:ilvl="3">
       <w:start w:val="1"/>
@@ -3944,6 +4126,7 @@
         </w:tabs>
         <w:ind w:left="1800" w:hanging="360"/>
       </w:pPr>
+      <w:rPr/>
     </w:lvl>
     <w:lvl w:ilvl="4">
       <w:start w:val="1"/>
@@ -3956,6 +4139,7 @@
         </w:tabs>
         <w:ind w:left="2160" w:hanging="360"/>
       </w:pPr>
+      <w:rPr/>
     </w:lvl>
     <w:lvl w:ilvl="5">
       <w:start w:val="1"/>
@@ -3968,6 +4152,7 @@
         </w:tabs>
         <w:ind w:left="2520" w:hanging="360"/>
       </w:pPr>
+      <w:rPr/>
     </w:lvl>
     <w:lvl w:ilvl="6">
       <w:start w:val="1"/>
@@ -3980,6 +4165,7 @@
         </w:tabs>
         <w:ind w:left="2880" w:hanging="360"/>
       </w:pPr>
+      <w:rPr/>
     </w:lvl>
     <w:lvl w:ilvl="7">
       <w:start w:val="1"/>
@@ -3992,6 +4178,7 @@
         </w:tabs>
         <w:ind w:left="3240" w:hanging="360"/>
       </w:pPr>
+      <w:rPr/>
     </w:lvl>
     <w:lvl w:ilvl="8">
       <w:start w:val="1"/>
@@ -4004,6 +4191,368 @@
         </w:tabs>
         <w:ind w:left="3600" w:hanging="360"/>
       </w:pPr>
+      <w:rPr/>
+    </w:lvl>
+  </w:abstractNum>
+  <w:abstractNum w:abstractNumId="2">
+    <w:lvl w:ilvl="0">
+      <w:start w:val="1"/>
+      <w:numFmt w:val="bullet"/>
+      <w:lvlText w:val=""/>
+      <w:lvlJc w:val="left"/>
+      <w:pPr>
+        <w:tabs>
+          <w:tab w:val="num" w:pos="0"/>
+        </w:tabs>
+        <w:ind w:left="720" w:hanging="360"/>
+      </w:pPr>
+      <w:rPr>
+        <w:rFonts w:ascii="Symbol" w:hAnsi="Symbol" w:cs="Symbol" w:hint="default"/>
+      </w:rPr>
+    </w:lvl>
+    <w:lvl w:ilvl="1">
+      <w:start w:val="1"/>
+      <w:numFmt w:val="decimal"/>
+      <w:lvlText w:val="%2."/>
+      <w:lvlJc w:val="left"/>
+      <w:pPr>
+        <w:tabs>
+          <w:tab w:val="num" w:pos="1080"/>
+        </w:tabs>
+        <w:ind w:left="1080" w:hanging="360"/>
+      </w:pPr>
+      <w:rPr/>
+    </w:lvl>
+    <w:lvl w:ilvl="2">
+      <w:start w:val="1"/>
+      <w:numFmt w:val="decimal"/>
+      <w:lvlText w:val="%3."/>
+      <w:lvlJc w:val="left"/>
+      <w:pPr>
+        <w:tabs>
+          <w:tab w:val="num" w:pos="1440"/>
+        </w:tabs>
+        <w:ind w:left="1440" w:hanging="360"/>
+      </w:pPr>
+      <w:rPr/>
+    </w:lvl>
+    <w:lvl w:ilvl="3">
+      <w:start w:val="1"/>
+      <w:numFmt w:val="decimal"/>
+      <w:lvlText w:val="%4."/>
+      <w:lvlJc w:val="left"/>
+      <w:pPr>
+        <w:tabs>
+          <w:tab w:val="num" w:pos="1800"/>
+        </w:tabs>
+        <w:ind w:left="1800" w:hanging="360"/>
+      </w:pPr>
+      <w:rPr/>
+    </w:lvl>
+    <w:lvl w:ilvl="4">
+      <w:start w:val="1"/>
+      <w:numFmt w:val="decimal"/>
+      <w:lvlText w:val="%5."/>
+      <w:lvlJc w:val="left"/>
+      <w:pPr>
+        <w:tabs>
+          <w:tab w:val="num" w:pos="2160"/>
+        </w:tabs>
+        <w:ind w:left="2160" w:hanging="360"/>
+      </w:pPr>
+      <w:rPr/>
+    </w:lvl>
+    <w:lvl w:ilvl="5">
+      <w:start w:val="1"/>
+      <w:numFmt w:val="decimal"/>
+      <w:lvlText w:val="%6."/>
+      <w:lvlJc w:val="left"/>
+      <w:pPr>
+        <w:tabs>
+          <w:tab w:val="num" w:pos="2520"/>
+        </w:tabs>
+        <w:ind w:left="2520" w:hanging="360"/>
+      </w:pPr>
+      <w:rPr/>
+    </w:lvl>
+    <w:lvl w:ilvl="6">
+      <w:start w:val="1"/>
+      <w:numFmt w:val="decimal"/>
+      <w:lvlText w:val="%7."/>
+      <w:lvlJc w:val="left"/>
+      <w:pPr>
+        <w:tabs>
+          <w:tab w:val="num" w:pos="2880"/>
+        </w:tabs>
+        <w:ind w:left="2880" w:hanging="360"/>
+      </w:pPr>
+      <w:rPr/>
+    </w:lvl>
+    <w:lvl w:ilvl="7">
+      <w:start w:val="1"/>
+      <w:numFmt w:val="decimal"/>
+      <w:lvlText w:val="%8."/>
+      <w:lvlJc w:val="left"/>
+      <w:pPr>
+        <w:tabs>
+          <w:tab w:val="num" w:pos="3240"/>
+        </w:tabs>
+        <w:ind w:left="3240" w:hanging="360"/>
+      </w:pPr>
+      <w:rPr/>
+    </w:lvl>
+    <w:lvl w:ilvl="8">
+      <w:start w:val="1"/>
+      <w:numFmt w:val="decimal"/>
+      <w:lvlText w:val="%9."/>
+      <w:lvlJc w:val="left"/>
+      <w:pPr>
+        <w:tabs>
+          <w:tab w:val="num" w:pos="3600"/>
+        </w:tabs>
+        <w:ind w:left="3600" w:hanging="360"/>
+      </w:pPr>
+      <w:rPr/>
+    </w:lvl>
+  </w:abstractNum>
+  <w:abstractNum w:abstractNumId="3">
+    <w:lvl w:ilvl="0">
+      <w:start w:val="1"/>
+      <w:numFmt w:val="bullet"/>
+      <w:lvlText w:val=""/>
+      <w:lvlJc w:val="left"/>
+      <w:pPr>
+        <w:tabs>
+          <w:tab w:val="num" w:pos="0"/>
+        </w:tabs>
+        <w:ind w:left="720" w:hanging="360"/>
+      </w:pPr>
+      <w:rPr>
+        <w:rFonts w:ascii="Symbol" w:hAnsi="Symbol" w:cs="Symbol" w:hint="default"/>
+      </w:rPr>
+    </w:lvl>
+    <w:lvl w:ilvl="1">
+      <w:start w:val="1"/>
+      <w:numFmt w:val="decimal"/>
+      <w:lvlText w:val="%2."/>
+      <w:lvlJc w:val="left"/>
+      <w:pPr>
+        <w:tabs>
+          <w:tab w:val="num" w:pos="1080"/>
+        </w:tabs>
+        <w:ind w:left="1080" w:hanging="360"/>
+      </w:pPr>
+      <w:rPr/>
+    </w:lvl>
+    <w:lvl w:ilvl="2">
+      <w:start w:val="1"/>
+      <w:numFmt w:val="decimal"/>
+      <w:lvlText w:val="%3."/>
+      <w:lvlJc w:val="left"/>
+      <w:pPr>
+        <w:tabs>
+          <w:tab w:val="num" w:pos="1440"/>
+        </w:tabs>
+        <w:ind w:left="1440" w:hanging="360"/>
+      </w:pPr>
+      <w:rPr/>
+    </w:lvl>
+    <w:lvl w:ilvl="3">
+      <w:start w:val="1"/>
+      <w:numFmt w:val="decimal"/>
+      <w:lvlText w:val="%4."/>
+      <w:lvlJc w:val="left"/>
+      <w:pPr>
+        <w:tabs>
+          <w:tab w:val="num" w:pos="1800"/>
+        </w:tabs>
+        <w:ind w:left="1800" w:hanging="360"/>
+      </w:pPr>
+      <w:rPr/>
+    </w:lvl>
+    <w:lvl w:ilvl="4">
+      <w:start w:val="1"/>
+      <w:numFmt w:val="decimal"/>
+      <w:lvlText w:val="%5."/>
+      <w:lvlJc w:val="left"/>
+      <w:pPr>
+        <w:tabs>
+          <w:tab w:val="num" w:pos="2160"/>
+        </w:tabs>
+        <w:ind w:left="2160" w:hanging="360"/>
+      </w:pPr>
+      <w:rPr/>
+    </w:lvl>
+    <w:lvl w:ilvl="5">
+      <w:start w:val="1"/>
+      <w:numFmt w:val="decimal"/>
+      <w:lvlText w:val="%6."/>
+      <w:lvlJc w:val="left"/>
+      <w:pPr>
+        <w:tabs>
+          <w:tab w:val="num" w:pos="2520"/>
+        </w:tabs>
+        <w:ind w:left="2520" w:hanging="360"/>
+      </w:pPr>
+      <w:rPr/>
+    </w:lvl>
+    <w:lvl w:ilvl="6">
+      <w:start w:val="1"/>
+      <w:numFmt w:val="decimal"/>
+      <w:lvlText w:val="%7."/>
+      <w:lvlJc w:val="left"/>
+      <w:pPr>
+        <w:tabs>
+          <w:tab w:val="num" w:pos="2880"/>
+        </w:tabs>
+        <w:ind w:left="2880" w:hanging="360"/>
+      </w:pPr>
+      <w:rPr/>
+    </w:lvl>
+    <w:lvl w:ilvl="7">
+      <w:start w:val="1"/>
+      <w:numFmt w:val="decimal"/>
+      <w:lvlText w:val="%8."/>
+      <w:lvlJc w:val="left"/>
+      <w:pPr>
+        <w:tabs>
+          <w:tab w:val="num" w:pos="3240"/>
+        </w:tabs>
+        <w:ind w:left="3240" w:hanging="360"/>
+      </w:pPr>
+      <w:rPr/>
+    </w:lvl>
+    <w:lvl w:ilvl="8">
+      <w:start w:val="1"/>
+      <w:numFmt w:val="decimal"/>
+      <w:lvlText w:val="%9."/>
+      <w:lvlJc w:val="left"/>
+      <w:pPr>
+        <w:tabs>
+          <w:tab w:val="num" w:pos="3600"/>
+        </w:tabs>
+        <w:ind w:left="3600" w:hanging="360"/>
+      </w:pPr>
+      <w:rPr/>
+    </w:lvl>
+  </w:abstractNum>
+  <w:abstractNum w:abstractNumId="4">
+    <w:lvl w:ilvl="0">
+      <w:start w:val="1"/>
+      <w:numFmt w:val="none"/>
+      <w:suff w:val="nothing"/>
+      <w:lvlText w:val=""/>
+      <w:lvlJc w:val="left"/>
+      <w:pPr>
+        <w:tabs>
+          <w:tab w:val="num" w:pos="0"/>
+        </w:tabs>
+        <w:ind w:left="0" w:hanging="0"/>
+      </w:pPr>
+    </w:lvl>
+    <w:lvl w:ilvl="1">
+      <w:start w:val="1"/>
+      <w:numFmt w:val="none"/>
+      <w:suff w:val="nothing"/>
+      <w:lvlText w:val=""/>
+      <w:lvlJc w:val="left"/>
+      <w:pPr>
+        <w:tabs>
+          <w:tab w:val="num" w:pos="0"/>
+        </w:tabs>
+        <w:ind w:left="0" w:hanging="0"/>
+      </w:pPr>
+    </w:lvl>
+    <w:lvl w:ilvl="2">
+      <w:start w:val="1"/>
+      <w:numFmt w:val="none"/>
+      <w:suff w:val="nothing"/>
+      <w:lvlText w:val=""/>
+      <w:lvlJc w:val="left"/>
+      <w:pPr>
+        <w:tabs>
+          <w:tab w:val="num" w:pos="0"/>
+        </w:tabs>
+        <w:ind w:left="0" w:hanging="0"/>
+      </w:pPr>
+    </w:lvl>
+    <w:lvl w:ilvl="3">
+      <w:start w:val="1"/>
+      <w:numFmt w:val="none"/>
+      <w:suff w:val="nothing"/>
+      <w:lvlText w:val=""/>
+      <w:lvlJc w:val="left"/>
+      <w:pPr>
+        <w:tabs>
+          <w:tab w:val="num" w:pos="0"/>
+        </w:tabs>
+        <w:ind w:left="0" w:hanging="0"/>
+      </w:pPr>
+    </w:lvl>
+    <w:lvl w:ilvl="4">
+      <w:start w:val="1"/>
+      <w:numFmt w:val="none"/>
+      <w:suff w:val="nothing"/>
+      <w:lvlText w:val=""/>
+      <w:lvlJc w:val="left"/>
+      <w:pPr>
+        <w:tabs>
+          <w:tab w:val="num" w:pos="0"/>
+        </w:tabs>
+        <w:ind w:left="0" w:hanging="0"/>
+      </w:pPr>
+    </w:lvl>
+    <w:lvl w:ilvl="5">
+      <w:start w:val="1"/>
+      <w:numFmt w:val="none"/>
+      <w:suff w:val="nothing"/>
+      <w:lvlText w:val=""/>
+      <w:lvlJc w:val="left"/>
+      <w:pPr>
+        <w:tabs>
+          <w:tab w:val="num" w:pos="0"/>
+        </w:tabs>
+        <w:ind w:left="0" w:hanging="0"/>
+      </w:pPr>
+    </w:lvl>
+    <w:lvl w:ilvl="6">
+      <w:start w:val="1"/>
+      <w:numFmt w:val="none"/>
+      <w:suff w:val="nothing"/>
+      <w:lvlText w:val=""/>
+      <w:lvlJc w:val="left"/>
+      <w:pPr>
+        <w:tabs>
+          <w:tab w:val="num" w:pos="0"/>
+        </w:tabs>
+        <w:ind w:left="0" w:hanging="0"/>
+      </w:pPr>
+    </w:lvl>
+    <w:lvl w:ilvl="7">
+      <w:start w:val="1"/>
+      <w:numFmt w:val="none"/>
+      <w:suff w:val="nothing"/>
+      <w:lvlText w:val=""/>
+      <w:lvlJc w:val="left"/>
+      <w:pPr>
+        <w:tabs>
+          <w:tab w:val="num" w:pos="0"/>
+        </w:tabs>
+        <w:ind w:left="0" w:hanging="0"/>
+      </w:pPr>
+    </w:lvl>
+    <w:lvl w:ilvl="8">
+      <w:start w:val="1"/>
+      <w:numFmt w:val="none"/>
+      <w:suff w:val="nothing"/>
+      <w:lvlText w:val=""/>
+      <w:lvlJc w:val="left"/>
+      <w:pPr>
+        <w:tabs>
+          <w:tab w:val="num" w:pos="0"/>
+        </w:tabs>
+        <w:ind w:left="0" w:hanging="0"/>
+      </w:pPr>
     </w:lvl>
   </w:abstractNum>
   <w:num w:numId="1">
@@ -4013,16 +4562,283 @@
     <w:abstractNumId w:val="2"/>
   </w:num>
   <w:num w:numId="3">
+    <w:abstractNumId w:val="3"/>
+  </w:num>
+  <w:num w:numId="4">
+    <w:abstractNumId w:val="4"/>
+  </w:num>
+  <w:num w:numId="5">
     <w:abstractNumId w:val="2"/>
     <w:lvlOverride w:ilvl="0">
       <w:startOverride w:val="1"/>
     </w:lvlOverride>
   </w:num>
-  <w:num w:numId="4">
+  <w:num w:numId="6">
+    <w:abstractNumId w:val="2"/>
+  </w:num>
+  <w:num w:numId="7">
+    <w:abstractNumId w:val="2"/>
+  </w:num>
+  <w:num w:numId="8">
+    <w:abstractNumId w:val="2"/>
+  </w:num>
+  <w:num w:numId="9">
+    <w:abstractNumId w:val="2"/>
+  </w:num>
+  <w:num w:numId="10">
+    <w:abstractNumId w:val="2"/>
+  </w:num>
+  <w:num w:numId="11">
+    <w:abstractNumId w:val="2"/>
+  </w:num>
+  <w:num w:numId="12">
+    <w:abstractNumId w:val="2"/>
+  </w:num>
+  <w:num w:numId="13">
+    <w:abstractNumId w:val="2"/>
+  </w:num>
+  <w:num w:numId="14">
+    <w:abstractNumId w:val="2"/>
+  </w:num>
+  <w:num w:numId="15">
+    <w:abstractNumId w:val="2"/>
+  </w:num>
+  <w:num w:numId="16">
+    <w:abstractNumId w:val="2"/>
+  </w:num>
+  <w:num w:numId="17">
+    <w:abstractNumId w:val="2"/>
+  </w:num>
+  <w:num w:numId="18">
+    <w:abstractNumId w:val="2"/>
+  </w:num>
+  <w:num w:numId="19">
+    <w:abstractNumId w:val="2"/>
+  </w:num>
+  <w:num w:numId="20">
+    <w:abstractNumId w:val="2"/>
+  </w:num>
+  <w:num w:numId="21">
+    <w:abstractNumId w:val="2"/>
+  </w:num>
+  <w:num w:numId="22">
+    <w:abstractNumId w:val="2"/>
+  </w:num>
+  <w:num w:numId="23">
+    <w:abstractNumId w:val="2"/>
+  </w:num>
+  <w:num w:numId="24">
+    <w:abstractNumId w:val="2"/>
+  </w:num>
+  <w:num w:numId="25">
+    <w:abstractNumId w:val="2"/>
+  </w:num>
+  <w:num w:numId="26">
+    <w:abstractNumId w:val="2"/>
+  </w:num>
+  <w:num w:numId="27">
+    <w:abstractNumId w:val="2"/>
+  </w:num>
+  <w:num w:numId="28">
+    <w:abstractNumId w:val="2"/>
+  </w:num>
+  <w:num w:numId="29">
+    <w:abstractNumId w:val="2"/>
+  </w:num>
+  <w:num w:numId="30">
+    <w:abstractNumId w:val="2"/>
+  </w:num>
+  <w:num w:numId="31">
+    <w:abstractNumId w:val="2"/>
+  </w:num>
+  <w:num w:numId="32">
+    <w:abstractNumId w:val="2"/>
+  </w:num>
+  <w:num w:numId="33">
+    <w:abstractNumId w:val="2"/>
+  </w:num>
+  <w:num w:numId="34">
+    <w:abstractNumId w:val="2"/>
+  </w:num>
+  <w:num w:numId="35">
+    <w:abstractNumId w:val="2"/>
+  </w:num>
+  <w:num w:numId="36">
+    <w:abstractNumId w:val="2"/>
+  </w:num>
+  <w:num w:numId="37">
+    <w:abstractNumId w:val="2"/>
+  </w:num>
+  <w:num w:numId="38">
+    <w:abstractNumId w:val="2"/>
+  </w:num>
+  <w:num w:numId="39">
+    <w:abstractNumId w:val="2"/>
+  </w:num>
+  <w:num w:numId="40">
+    <w:abstractNumId w:val="2"/>
+  </w:num>
+  <w:num w:numId="41">
+    <w:abstractNumId w:val="2"/>
+  </w:num>
+  <w:num w:numId="42">
+    <w:abstractNumId w:val="2"/>
+  </w:num>
+  <w:num w:numId="43">
+    <w:abstractNumId w:val="2"/>
+  </w:num>
+  <w:num w:numId="44">
+    <w:abstractNumId w:val="2"/>
+  </w:num>
+  <w:num w:numId="45">
+    <w:abstractNumId w:val="2"/>
+  </w:num>
+  <w:num w:numId="46">
+    <w:abstractNumId w:val="2"/>
+  </w:num>
+  <w:num w:numId="47">
+    <w:abstractNumId w:val="2"/>
+  </w:num>
+  <w:num w:numId="48">
+    <w:abstractNumId w:val="2"/>
+  </w:num>
+  <w:num w:numId="49">
+    <w:abstractNumId w:val="2"/>
+  </w:num>
+  <w:num w:numId="50">
+    <w:abstractNumId w:val="2"/>
+  </w:num>
+  <w:num w:numId="51">
+    <w:abstractNumId w:val="2"/>
+  </w:num>
+  <w:num w:numId="52">
+    <w:abstractNumId w:val="2"/>
+  </w:num>
+  <w:num w:numId="53">
+    <w:abstractNumId w:val="2"/>
+  </w:num>
+  <w:num w:numId="54">
+    <w:abstractNumId w:val="2"/>
+  </w:num>
+  <w:num w:numId="55">
+    <w:abstractNumId w:val="2"/>
+  </w:num>
+  <w:num w:numId="56">
+    <w:abstractNumId w:val="2"/>
+  </w:num>
+  <w:num w:numId="57">
+    <w:abstractNumId w:val="2"/>
+  </w:num>
+  <w:num w:numId="58">
+    <w:abstractNumId w:val="2"/>
+  </w:num>
+  <w:num w:numId="59">
+    <w:abstractNumId w:val="2"/>
+  </w:num>
+  <w:num w:numId="60">
+    <w:abstractNumId w:val="2"/>
+  </w:num>
+  <w:num w:numId="61">
+    <w:abstractNumId w:val="2"/>
+  </w:num>
+  <w:num w:numId="62">
+    <w:abstractNumId w:val="2"/>
+  </w:num>
+  <w:num w:numId="63">
+    <w:abstractNumId w:val="2"/>
+  </w:num>
+  <w:num w:numId="64">
+    <w:abstractNumId w:val="2"/>
+  </w:num>
+  <w:num w:numId="65">
+    <w:abstractNumId w:val="2"/>
+  </w:num>
+  <w:num w:numId="66">
+    <w:abstractNumId w:val="2"/>
+  </w:num>
+  <w:num w:numId="67">
+    <w:abstractNumId w:val="2"/>
+  </w:num>
+  <w:num w:numId="68">
+    <w:abstractNumId w:val="2"/>
+  </w:num>
+  <w:num w:numId="69">
+    <w:abstractNumId w:val="2"/>
+  </w:num>
+  <w:num w:numId="70">
+    <w:abstractNumId w:val="2"/>
+  </w:num>
+  <w:num w:numId="71">
+    <w:abstractNumId w:val="2"/>
+  </w:num>
+  <w:num w:numId="72">
+    <w:abstractNumId w:val="2"/>
+  </w:num>
+  <w:num w:numId="73">
+    <w:abstractNumId w:val="2"/>
+  </w:num>
+  <w:num w:numId="74">
+    <w:abstractNumId w:val="2"/>
+  </w:num>
+  <w:num w:numId="75">
+    <w:abstractNumId w:val="2"/>
+  </w:num>
+  <w:num w:numId="76">
     <w:abstractNumId w:val="2"/>
     <w:lvlOverride w:ilvl="0">
       <w:startOverride w:val="1"/>
     </w:lvlOverride>
+  </w:num>
+  <w:num w:numId="77">
+    <w:abstractNumId w:val="2"/>
+  </w:num>
+  <w:num w:numId="78">
+    <w:abstractNumId w:val="2"/>
+  </w:num>
+  <w:num w:numId="79">
+    <w:abstractNumId w:val="2"/>
+  </w:num>
+  <w:num w:numId="80">
+    <w:abstractNumId w:val="2"/>
+  </w:num>
+  <w:num w:numId="81">
+    <w:abstractNumId w:val="2"/>
+  </w:num>
+  <w:num w:numId="82">
+    <w:abstractNumId w:val="2"/>
+  </w:num>
+  <w:num w:numId="83">
+    <w:abstractNumId w:val="2"/>
+  </w:num>
+  <w:num w:numId="84">
+    <w:abstractNumId w:val="2"/>
+  </w:num>
+  <w:num w:numId="85">
+    <w:abstractNumId w:val="2"/>
+  </w:num>
+  <w:num w:numId="86">
+    <w:abstractNumId w:val="2"/>
+  </w:num>
+  <w:num w:numId="87">
+    <w:abstractNumId w:val="2"/>
+  </w:num>
+  <w:num w:numId="88">
+    <w:abstractNumId w:val="2"/>
+  </w:num>
+  <w:num w:numId="89">
+    <w:abstractNumId w:val="2"/>
+  </w:num>
+  <w:num w:numId="90">
+    <w:abstractNumId w:val="2"/>
+  </w:num>
+  <w:num w:numId="91">
+    <w:abstractNumId w:val="2"/>
+  </w:num>
+  <w:num w:numId="92">
+    <w:abstractNumId w:val="2"/>
+  </w:num>
+  <w:num w:numId="93">
+    <w:abstractNumId w:val="2"/>
   </w:num>
 </w:numbering>
 </file>
@@ -4049,10 +4865,11 @@
     <w:qFormat/>
     <w:pPr>
       <w:widowControl w:val="false"/>
-      <w:kinsoku w:val="true"/>
-      <w:overflowPunct w:val="true"/>
-      <w:autoSpaceDE w:val="true"/>
+      <w:suppressAutoHyphens w:val="true"/>
+      <w:overflowPunct w:val="false"/>
       <w:bidi w:val="0"/>
+      <w:spacing w:before="0" w:after="0"/>
+      <w:jc w:val="left"/>
     </w:pPr>
     <w:rPr>
       <w:rFonts w:ascii="Arial" w:hAnsi="Arial" w:eastAsia="Arial" w:cs="Arial"/>
@@ -4199,13 +5016,28 @@
   <w:style w:type="character" w:styleId="EndnoteCharacters">
     <w:name w:val="Endnote Characters"/>
     <w:qFormat/>
-    <w:rPr/>
+    <w:rPr>
+      <w:vertAlign w:val="superscript"/>
+    </w:rPr>
   </w:style>
   <w:style w:type="character" w:styleId="EndnoteReference">
     <w:name w:val="Endnote Reference"/>
     <w:rPr>
       <w:vertAlign w:val="superscript"/>
     </w:rPr>
+  </w:style>
+  <w:style w:type="character" w:styleId="Emphasis">
+    <w:name w:val="Emphasis"/>
+    <w:qFormat/>
+    <w:rPr>
+      <w:i/>
+      <w:iCs/>
+    </w:rPr>
+  </w:style>
+  <w:style w:type="character" w:styleId="NumberingSymbols">
+    <w:name w:val="Numbering Symbols"/>
+    <w:qFormat/>
+    <w:rPr/>
   </w:style>
   <w:style w:type="paragraph" w:styleId="Heading">
     <w:name w:val="Heading"/>
@@ -4280,10 +5112,11 @@
     <w:qFormat/>
     <w:pPr>
       <w:widowControl w:val="false"/>
-      <w:kinsoku w:val="true"/>
-      <w:overflowPunct w:val="true"/>
-      <w:autoSpaceDE w:val="true"/>
+      <w:suppressAutoHyphens w:val="true"/>
+      <w:overflowPunct w:val="false"/>
       <w:bidi w:val="0"/>
+      <w:spacing w:before="0" w:after="0"/>
+      <w:jc w:val="left"/>
     </w:pPr>
     <w:rPr>
       <w:rFonts w:ascii="Arial" w:hAnsi="Arial" w:eastAsia="Arial" w:cs="Arial"/>
@@ -4301,10 +5134,11 @@
     <w:qFormat/>
     <w:pPr>
       <w:widowControl w:val="false"/>
-      <w:kinsoku w:val="true"/>
-      <w:overflowPunct w:val="true"/>
-      <w:autoSpaceDE w:val="true"/>
+      <w:suppressAutoHyphens w:val="true"/>
+      <w:overflowPunct w:val="false"/>
       <w:bidi w:val="0"/>
+      <w:spacing w:before="0" w:after="0"/>
+      <w:jc w:val="left"/>
     </w:pPr>
     <w:rPr>
       <w:rFonts w:ascii="Arial" w:hAnsi="Arial" w:eastAsia="Arial" w:cs="Arial"/>
@@ -4334,6 +5168,16 @@
       <w:suppressLineNumbers/>
       <w:ind w:hanging="340" w:left="340"/>
     </w:pPr>
+    <w:rPr>
+      <w:sz w:val="20"/>
+      <w:szCs w:val="20"/>
+    </w:rPr>
+  </w:style>
+  <w:style w:type="paragraph" w:styleId="Comment">
+    <w:name w:val="Comment"/>
+    <w:basedOn w:val="Normal"/>
+    <w:qFormat/>
+    <w:pPr/>
     <w:rPr>
       <w:sz w:val="20"/>
       <w:szCs w:val="20"/>

</xml_diff>

<commit_message>
Update position paper PDF
</commit_message>
<xml_diff>
--- a/docs/Common_Sour_Fig_Position_Paper.docx
+++ b/docs/Common_Sour_Fig_Position_Paper.docx
@@ -3114,66 +3114,6 @@
     <w:p>
       <w:pPr>
         <w:pStyle w:val="Normal"/>
-        <w:rPr/>
-      </w:pPr>
-      <w:r>
-        <w:rPr/>
-      </w:r>
-    </w:p>
-    <w:p>
-      <w:pPr>
-        <w:pStyle w:val="ListParagraph"/>
-        <w:bidi w:val="0"/>
-        <w:spacing w:before="0" w:after="240"/>
-        <w:jc w:val="left"/>
-        <w:rPr/>
-      </w:pPr>
-      <w:r>
-        <w:rPr/>
-      </w:r>
-    </w:p>
-    <w:p>
-      <w:pPr>
-        <w:pStyle w:val="ListParagraph"/>
-        <w:bidi w:val="0"/>
-        <w:spacing w:before="0" w:after="240"/>
-        <w:jc w:val="left"/>
-        <w:rPr/>
-      </w:pPr>
-      <w:r>
-        <w:rPr/>
-      </w:r>
-    </w:p>
-    <w:p>
-      <w:pPr>
-        <w:pStyle w:val="ListParagraph"/>
-        <w:bidi w:val="0"/>
-        <w:spacing w:before="0" w:after="240"/>
-        <w:jc w:val="left"/>
-        <w:rPr/>
-      </w:pPr>
-      <w:r>
-        <w:rPr/>
-      </w:r>
-    </w:p>
-    <w:p>
-      <w:pPr>
-        <w:pStyle w:val="ListParagraph"/>
-        <w:bidi w:val="0"/>
-        <w:spacing w:before="0" w:after="240"/>
-        <w:jc w:val="left"/>
-        <w:rPr/>
-      </w:pPr>
-      <w:r>
-        <w:rPr/>
-      </w:r>
-    </w:p>
-    <w:p>
-      <w:pPr>
-        <w:pStyle w:val="ListParagraph"/>
-        <w:bidi w:val="0"/>
-        <w:spacing w:before="0" w:after="240"/>
-        <w:jc w:val="left"/>
         <w:rPr/>
       </w:pPr>
       <w:r>

</xml_diff>